<commit_message>
Herramientas para hacer la auditoria de redes fueron modificadas a herramientas profesionales
</commit_message>
<xml_diff>
--- a/SILAIS - Auditoria/AVANCES_PROYECTO_FINAL/INFORME_PRELIMINAR_AUDITORIA_DE_REDES.docx
+++ b/SILAIS - Auditoria/AVANCES_PROYECTO_FINAL/INFORME_PRELIMINAR_AUDITORIA_DE_REDES.docx
@@ -1,6 +1,6 @@
 
 <file path=word/document.xml><?xml version="1.0" encoding="utf-8"?>
-<w:document xmlns:wpc="http://schemas.microsoft.com/office/word/2010/wordprocessingCanvas" xmlns:cx="http://schemas.microsoft.com/office/drawing/2014/chartex" xmlns:cx1="http://schemas.microsoft.com/office/drawing/2015/9/8/chartex" xmlns:cx2="http://schemas.microsoft.com/office/drawing/2015/10/21/chartex" xmlns:cx3="http://schemas.microsoft.com/office/drawing/2016/5/9/chartex" xmlns:cx4="http://schemas.microsoft.com/office/drawing/2016/5/10/chartex" xmlns:cx5="http://schemas.microsoft.com/office/drawing/2016/5/11/chartex" xmlns:cx6="http://schemas.microsoft.com/office/drawing/2016/5/12/chartex" xmlns:cx7="http://schemas.microsoft.com/office/drawing/2016/5/13/chartex" xmlns:cx8="http://schemas.microsoft.com/office/drawing/2016/5/14/chartex" xmlns:mc="http://schemas.openxmlformats.org/markup-compatibility/2006" xmlns:aink="http://schemas.microsoft.com/office/drawing/2016/ink" xmlns:am3d="http://schemas.microsoft.com/office/drawing/2017/model3d" xmlns:o="urn:schemas-microsoft-com:office:office" xmlns:r="http://schemas.openxmlformats.org/officeDocument/2006/relationships" xmlns:m="http://schemas.openxmlformats.org/officeDocument/2006/math" xmlns:v="urn:schemas-microsoft-com:vml" xmlns:wp14="http://schemas.microsoft.com/office/word/2010/wordprocessingDrawing" xmlns:wp="http://schemas.openxmlformats.org/drawingml/2006/wordprocessingDrawing" xmlns:w10="urn:schemas-microsoft-com:office:word" xmlns:w="http://schemas.openxmlformats.org/wordprocessingml/2006/main" xmlns:w14="http://schemas.microsoft.com/office/word/2010/wordml" xmlns:w15="http://schemas.microsoft.com/office/word/2012/wordml" xmlns:w16cex="http://schemas.microsoft.com/office/word/2018/wordml/cex" xmlns:w16cid="http://schemas.microsoft.com/office/word/2016/wordml/cid" xmlns:w16="http://schemas.microsoft.com/office/word/2018/wordml" xmlns:w16sdtdh="http://schemas.microsoft.com/office/word/2020/wordml/sdtdatahash" xmlns:w16se="http://schemas.microsoft.com/office/word/2015/wordml/symex" xmlns:wpg="http://schemas.microsoft.com/office/word/2010/wordprocessingGroup" xmlns:wpi="http://schemas.microsoft.com/office/word/2010/wordprocessingInk" xmlns:wne="http://schemas.microsoft.com/office/word/2006/wordml" xmlns:wps="http://schemas.microsoft.com/office/word/2010/wordprocessingShape" mc:Ignorable="w14 w15 w16se w16cid w16 w16cex w16sdtdh wp14">
+<w:document xmlns:wpc="http://schemas.microsoft.com/office/word/2010/wordprocessingCanvas" xmlns:mc="http://schemas.openxmlformats.org/markup-compatibility/2006" xmlns:o="urn:schemas-microsoft-com:office:office" xmlns:r="http://schemas.openxmlformats.org/officeDocument/2006/relationships" xmlns:m="http://schemas.openxmlformats.org/officeDocument/2006/math" xmlns:v="urn:schemas-microsoft-com:vml" xmlns:wp14="http://schemas.microsoft.com/office/word/2010/wordprocessingDrawing" xmlns:wp="http://schemas.openxmlformats.org/drawingml/2006/wordprocessingDrawing" xmlns:w10="urn:schemas-microsoft-com:office:word" xmlns:w="http://schemas.openxmlformats.org/wordprocessingml/2006/main" xmlns:w14="http://schemas.microsoft.com/office/word/2010/wordml" xmlns:wpg="http://schemas.microsoft.com/office/word/2010/wordprocessingGroup" xmlns:wpi="http://schemas.microsoft.com/office/word/2010/wordprocessingInk" xmlns:wne="http://schemas.microsoft.com/office/word/2006/wordml" xmlns:wps="http://schemas.microsoft.com/office/word/2010/wordprocessingShape" mc:Ignorable="w14 wp14">
   <w:body>
     <w:p>
       <w:pPr>
@@ -36,7 +36,7 @@
                     </pic:cNvPicPr>
                   </pic:nvPicPr>
                   <pic:blipFill>
-                    <a:blip r:embed="rId5">
+                    <a:blip r:embed="rId6">
                       <a:extLst>
                         <a:ext uri="{28A0092B-C50C-407E-A947-70E740481C1C}">
                           <a14:useLocalDpi xmlns:a14="http://schemas.microsoft.com/office/drawing/2010/main" val="0"/>
@@ -238,6 +238,8 @@
           <w:sz w:val="32"/>
         </w:rPr>
       </w:pPr>
+      <w:bookmarkStart w:id="0" w:name="_GoBack"/>
+      <w:bookmarkEnd w:id="0"/>
     </w:p>
     <w:p>
       <w:pPr>
@@ -257,16 +259,16 @@
         <mc:AlternateContent>
           <mc:Choice Requires="wps">
             <w:drawing>
-              <wp:anchor distT="0" distB="0" distL="114300" distR="114300" simplePos="0" relativeHeight="251663360" behindDoc="0" locked="0" layoutInCell="1" allowOverlap="1" wp14:anchorId="7C92DBA7" wp14:editId="29018384">
+              <wp:anchor distT="0" distB="0" distL="114300" distR="114300" simplePos="0" relativeHeight="251663360" behindDoc="0" locked="0" layoutInCell="1" allowOverlap="1" wp14:anchorId="7C92DBA7" wp14:editId="3511BB83">
                 <wp:simplePos x="0" y="0"/>
                 <wp:positionH relativeFrom="column">
-                  <wp:posOffset>3971925</wp:posOffset>
+                  <wp:posOffset>1994535</wp:posOffset>
                 </wp:positionH>
                 <wp:positionV relativeFrom="paragraph">
-                  <wp:posOffset>289560</wp:posOffset>
+                  <wp:posOffset>182880</wp:posOffset>
                 </wp:positionV>
                 <wp:extent cx="0" cy="1857375"/>
-                <wp:effectExtent l="19050" t="0" r="19050" b="28575"/>
+                <wp:effectExtent l="19050" t="0" r="19050" b="9525"/>
                 <wp:wrapNone/>
                 <wp:docPr id="1253347251" name="Straight Connector 5"/>
                 <wp:cNvGraphicFramePr/>
@@ -313,7 +315,7 @@
           </mc:Choice>
           <mc:Fallback>
             <w:pict>
-              <v:line w14:anchorId="56DD10C5" id="Straight Connector 5" o:spid="_x0000_s1026" style="position:absolute;z-index:251663360;visibility:visible;mso-wrap-style:square;mso-width-percent:0;mso-height-percent:0;mso-wrap-distance-left:9pt;mso-wrap-distance-top:0;mso-wrap-distance-right:9pt;mso-wrap-distance-bottom:0;mso-position-horizontal:absolute;mso-position-horizontal-relative:text;mso-position-vertical:absolute;mso-position-vertical-relative:text;mso-width-percent:0;mso-height-percent:0;mso-width-relative:margin;mso-height-relative:margin" from="312.75pt,22.8pt" to="312.75pt,169.05pt" o:gfxdata="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" strokecolor="black [3200]" strokeweight="2.25pt">
+              <v:line id="Straight Connector 5" o:spid="_x0000_s1026" style="position:absolute;z-index:251663360;visibility:visible;mso-wrap-style:square;mso-width-percent:0;mso-height-percent:0;mso-wrap-distance-left:9pt;mso-wrap-distance-top:0;mso-wrap-distance-right:9pt;mso-wrap-distance-bottom:0;mso-position-horizontal:absolute;mso-position-horizontal-relative:text;mso-position-vertical:absolute;mso-position-vertical-relative:text;mso-width-percent:0;mso-height-percent:0;mso-width-relative:margin;mso-height-relative:margin" from="157.05pt,14.4pt" to="157.05pt,160.65pt" o:gfxdata="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" strokecolor="black [3200]" strokeweight="2.25pt">
                 <v:stroke joinstyle="miter"/>
               </v:line>
             </w:pict>
@@ -329,7 +331,79 @@
         <mc:AlternateContent>
           <mc:Choice Requires="wps">
             <w:drawing>
-              <wp:anchor distT="45720" distB="45720" distL="114300" distR="114300" simplePos="0" relativeHeight="251659264" behindDoc="0" locked="0" layoutInCell="1" allowOverlap="1" wp14:anchorId="3A1F1D85" wp14:editId="56BC447E">
+              <wp:anchor distT="0" distB="0" distL="114300" distR="114300" simplePos="0" relativeHeight="251662336" behindDoc="0" locked="0" layoutInCell="1" allowOverlap="1" wp14:anchorId="0F9C7310" wp14:editId="6B96324D">
+                <wp:simplePos x="0" y="0"/>
+                <wp:positionH relativeFrom="column">
+                  <wp:posOffset>-110490</wp:posOffset>
+                </wp:positionH>
+                <wp:positionV relativeFrom="paragraph">
+                  <wp:posOffset>220980</wp:posOffset>
+                </wp:positionV>
+                <wp:extent cx="9525" cy="1895475"/>
+                <wp:effectExtent l="19050" t="19050" r="28575" b="9525"/>
+                <wp:wrapNone/>
+                <wp:docPr id="1702746262" name="Straight Connector 3"/>
+                <wp:cNvGraphicFramePr/>
+                <a:graphic xmlns:a="http://schemas.openxmlformats.org/drawingml/2006/main">
+                  <a:graphicData uri="http://schemas.microsoft.com/office/word/2010/wordprocessingShape">
+                    <wps:wsp>
+                      <wps:cNvCnPr/>
+                      <wps:spPr>
+                        <a:xfrm flipH="1">
+                          <a:off x="0" y="0"/>
+                          <a:ext cx="9525" cy="1895475"/>
+                        </a:xfrm>
+                        <a:prstGeom prst="line">
+                          <a:avLst/>
+                        </a:prstGeom>
+                        <a:ln w="28575"/>
+                      </wps:spPr>
+                      <wps:style>
+                        <a:lnRef idx="3">
+                          <a:schemeClr val="dk1"/>
+                        </a:lnRef>
+                        <a:fillRef idx="0">
+                          <a:schemeClr val="dk1"/>
+                        </a:fillRef>
+                        <a:effectRef idx="2">
+                          <a:schemeClr val="dk1"/>
+                        </a:effectRef>
+                        <a:fontRef idx="minor">
+                          <a:schemeClr val="tx1"/>
+                        </a:fontRef>
+                      </wps:style>
+                      <wps:bodyPr/>
+                    </wps:wsp>
+                  </a:graphicData>
+                </a:graphic>
+                <wp14:sizeRelH relativeFrom="margin">
+                  <wp14:pctWidth>0</wp14:pctWidth>
+                </wp14:sizeRelH>
+                <wp14:sizeRelV relativeFrom="margin">
+                  <wp14:pctHeight>0</wp14:pctHeight>
+                </wp14:sizeRelV>
+              </wp:anchor>
+            </w:drawing>
+          </mc:Choice>
+          <mc:Fallback>
+            <w:pict>
+              <v:line id="Straight Connector 3" o:spid="_x0000_s1026" style="position:absolute;flip:x;z-index:251662336;visibility:visible;mso-wrap-style:square;mso-width-percent:0;mso-height-percent:0;mso-wrap-distance-left:9pt;mso-wrap-distance-top:0;mso-wrap-distance-right:9pt;mso-wrap-distance-bottom:0;mso-position-horizontal:absolute;mso-position-horizontal-relative:text;mso-position-vertical:absolute;mso-position-vertical-relative:text;mso-width-percent:0;mso-height-percent:0;mso-width-relative:margin;mso-height-relative:margin" from="-8.7pt,17.4pt" to="-7.95pt,166.65pt" o:gfxdata="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" strokecolor="black [3200]" strokeweight="2.25pt">
+                <v:stroke joinstyle="miter"/>
+              </v:line>
+            </w:pict>
+          </mc:Fallback>
+        </mc:AlternateContent>
+      </w:r>
+      <w:r>
+        <w:rPr>
+          <w:rFonts w:ascii="Arial" w:hAnsi="Arial" w:cs="Arial"/>
+          <w:noProof/>
+          <w:lang w:eastAsia="es-US"/>
+        </w:rPr>
+        <mc:AlternateContent>
+          <mc:Choice Requires="wps">
+            <w:drawing>
+              <wp:anchor distT="45720" distB="45720" distL="114300" distR="114300" simplePos="0" relativeHeight="251659264" behindDoc="0" locked="0" layoutInCell="1" allowOverlap="1" wp14:anchorId="3A1F1D85" wp14:editId="4FC90A68">
                 <wp:simplePos x="0" y="0"/>
                 <wp:positionH relativeFrom="margin">
                   <wp:posOffset>-76200</wp:posOffset>
@@ -490,7 +564,7 @@
           </mc:Choice>
           <mc:Fallback>
             <w:pict>
-              <v:shapetype w14:anchorId="3A1F1D85" id="_x0000_t202" coordsize="21600,21600" o:spt="202" path="m,l,21600r21600,l21600,xe">
+              <v:shapetype id="_x0000_t202" coordsize="21600,21600" o:spt="202" path="m,l,21600r21600,l21600,xe">
                 <v:stroke joinstyle="miter"/>
                 <v:path gradientshapeok="t" o:connecttype="rect"/>
               </v:shapetype>
@@ -609,78 +683,6 @@
       <w:r>
         <w:rPr>
           <w:rFonts w:ascii="Arial" w:hAnsi="Arial" w:cs="Arial"/>
-          <w:noProof/>
-          <w:lang w:eastAsia="es-US"/>
-        </w:rPr>
-        <mc:AlternateContent>
-          <mc:Choice Requires="wps">
-            <w:drawing>
-              <wp:anchor distT="0" distB="0" distL="114300" distR="114300" simplePos="0" relativeHeight="251662336" behindDoc="0" locked="0" layoutInCell="1" allowOverlap="1" wp14:anchorId="0F9C7310" wp14:editId="7FF6E5C1">
-                <wp:simplePos x="0" y="0"/>
-                <wp:positionH relativeFrom="column">
-                  <wp:posOffset>1834515</wp:posOffset>
-                </wp:positionH>
-                <wp:positionV relativeFrom="paragraph">
-                  <wp:posOffset>281940</wp:posOffset>
-                </wp:positionV>
-                <wp:extent cx="9525" cy="1895475"/>
-                <wp:effectExtent l="19050" t="19050" r="28575" b="28575"/>
-                <wp:wrapNone/>
-                <wp:docPr id="1702746262" name="Straight Connector 3"/>
-                <wp:cNvGraphicFramePr/>
-                <a:graphic xmlns:a="http://schemas.openxmlformats.org/drawingml/2006/main">
-                  <a:graphicData uri="http://schemas.microsoft.com/office/word/2010/wordprocessingShape">
-                    <wps:wsp>
-                      <wps:cNvCnPr/>
-                      <wps:spPr>
-                        <a:xfrm flipH="1">
-                          <a:off x="0" y="0"/>
-                          <a:ext cx="9525" cy="1895475"/>
-                        </a:xfrm>
-                        <a:prstGeom prst="line">
-                          <a:avLst/>
-                        </a:prstGeom>
-                        <a:ln w="28575"/>
-                      </wps:spPr>
-                      <wps:style>
-                        <a:lnRef idx="3">
-                          <a:schemeClr val="dk1"/>
-                        </a:lnRef>
-                        <a:fillRef idx="0">
-                          <a:schemeClr val="dk1"/>
-                        </a:fillRef>
-                        <a:effectRef idx="2">
-                          <a:schemeClr val="dk1"/>
-                        </a:effectRef>
-                        <a:fontRef idx="minor">
-                          <a:schemeClr val="tx1"/>
-                        </a:fontRef>
-                      </wps:style>
-                      <wps:bodyPr/>
-                    </wps:wsp>
-                  </a:graphicData>
-                </a:graphic>
-                <wp14:sizeRelH relativeFrom="margin">
-                  <wp14:pctWidth>0</wp14:pctWidth>
-                </wp14:sizeRelH>
-                <wp14:sizeRelV relativeFrom="margin">
-                  <wp14:pctHeight>0</wp14:pctHeight>
-                </wp14:sizeRelV>
-              </wp:anchor>
-            </w:drawing>
-          </mc:Choice>
-          <mc:Fallback>
-            <w:pict>
-              <v:line w14:anchorId="3EF53867" id="Straight Connector 3" o:spid="_x0000_s1026" style="position:absolute;flip:x;z-index:251662336;visibility:visible;mso-wrap-style:square;mso-width-percent:0;mso-height-percent:0;mso-wrap-distance-left:9pt;mso-wrap-distance-top:0;mso-wrap-distance-right:9pt;mso-wrap-distance-bottom:0;mso-position-horizontal:absolute;mso-position-horizontal-relative:text;mso-position-vertical:absolute;mso-position-vertical-relative:text;mso-width-percent:0;mso-height-percent:0;mso-width-relative:margin;mso-height-relative:margin" from="144.45pt,22.2pt" to="145.2pt,171.45pt" o:gfxdata="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" strokecolor="black [3200]" strokeweight="2.25pt">
-                <v:stroke joinstyle="miter"/>
-              </v:line>
-            </w:pict>
-          </mc:Fallback>
-        </mc:AlternateContent>
-      </w:r>
-      <w:r>
-        <w:rPr>
-          <w:rFonts w:ascii="Arial" w:hAnsi="Arial" w:cs="Arial"/>
           <w:b/>
           <w:sz w:val="28"/>
         </w:rPr>
@@ -811,7 +813,7 @@
               </wp:anchor>
             </w:drawing>
           </mc:Choice>
-          <mc:Fallback>
+          <mc:Fallback xmlns:w16se="http://schemas.microsoft.com/office/word/2015/wordml/symex" xmlns:w16sdtdh="http://schemas.microsoft.com/office/word/2020/wordml/sdtdatahash" xmlns:w16="http://schemas.microsoft.com/office/word/2018/wordml" xmlns:w16cid="http://schemas.microsoft.com/office/word/2016/wordml/cid" xmlns:w16cex="http://schemas.microsoft.com/office/word/2018/wordml/cex" xmlns:w15="http://schemas.microsoft.com/office/word/2012/wordml" xmlns:am3d="http://schemas.microsoft.com/office/drawing/2017/model3d" xmlns:aink="http://schemas.microsoft.com/office/drawing/2016/ink" xmlns:cx8="http://schemas.microsoft.com/office/drawing/2016/5/14/chartex" xmlns:cx7="http://schemas.microsoft.com/office/drawing/2016/5/13/chartex" xmlns:cx6="http://schemas.microsoft.com/office/drawing/2016/5/12/chartex" xmlns:cx5="http://schemas.microsoft.com/office/drawing/2016/5/11/chartex" xmlns:cx4="http://schemas.microsoft.com/office/drawing/2016/5/10/chartex" xmlns:cx3="http://schemas.microsoft.com/office/drawing/2016/5/9/chartex" xmlns:cx2="http://schemas.microsoft.com/office/drawing/2015/10/21/chartex" xmlns:cx1="http://schemas.microsoft.com/office/drawing/2015/9/8/chartex" xmlns:cx="http://schemas.microsoft.com/office/drawing/2014/chartex">
             <w:pict>
               <v:shape w14:anchorId="3DD91F1D" id="Text Box 1" o:spid="_x0000_s1027" type="#_x0000_t202" style="position:absolute;margin-left:390.6pt;margin-top:4.15pt;width:220.8pt;height:122.25pt;z-index:251661312;visibility:visible;mso-wrap-style:square;mso-width-percent:0;mso-height-percent:0;mso-wrap-distance-left:9pt;mso-wrap-distance-top:3.6pt;mso-wrap-distance-right:9pt;mso-wrap-distance-bottom:3.6pt;mso-position-horizontal:absolute;mso-position-horizontal-relative:page;mso-position-vertical:absolute;mso-position-vertical-relative:text;mso-width-percent:0;mso-height-percent:0;mso-width-relative:margin;mso-height-relative:margin;v-text-anchor:top" o:gfxdata="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" stroked="f">
                 <v:textbox>
@@ -1052,7 +1054,7 @@
           </mc:Choice>
           <mc:Fallback>
             <w:pict>
-              <v:shape w14:anchorId="7AFD2BB7" id="Text Box 2" o:spid="_x0000_s1028" type="#_x0000_t202" style="position:absolute;margin-left:163.5pt;margin-top:.55pt;width:130.5pt;height:153pt;z-index:251660288;visibility:visible;mso-wrap-style:square;mso-width-percent:0;mso-height-percent:0;mso-wrap-distance-left:9pt;mso-wrap-distance-top:3.6pt;mso-wrap-distance-right:9pt;mso-wrap-distance-bottom:3.6pt;mso-position-horizontal:absolute;mso-position-horizontal-relative:margin;mso-position-vertical:absolute;mso-position-vertical-relative:text;mso-width-percent:0;mso-height-percent:0;mso-width-relative:margin;mso-height-relative:margin;v-text-anchor:top" o:gfxdata="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" stroked="f">
+              <v:shape id="Text Box 2" o:spid="_x0000_s1028" type="#_x0000_t202" style="position:absolute;margin-left:163.5pt;margin-top:.55pt;width:130.5pt;height:153pt;z-index:251660288;visibility:visible;mso-wrap-style:square;mso-width-percent:0;mso-height-percent:0;mso-wrap-distance-left:9pt;mso-wrap-distance-top:3.6pt;mso-wrap-distance-right:9pt;mso-wrap-distance-bottom:3.6pt;mso-position-horizontal:absolute;mso-position-horizontal-relative:margin;mso-position-vertical:absolute;mso-position-vertical-relative:text;mso-width-percent:0;mso-height-percent:0;mso-width-relative:margin;mso-height-relative:margin;v-text-anchor:top" o:gfxdata="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" stroked="f">
                 <v:textbox>
                   <w:txbxContent>
                     <w:p>
@@ -1351,37 +1353,7 @@
           <w:lang w:eastAsia="es-US"/>
           <w14:ligatures w14:val="none"/>
         </w:rPr>
-        <w:t>09</w:t>
-      </w:r>
-      <w:r>
-        <w:rPr>
-          <w:rFonts w:ascii="Arial" w:eastAsia="Times New Roman" w:hAnsi="Arial" w:cs="Arial"/>
-          <w:color w:val="000000"/>
-          <w:kern w:val="0"/>
-          <w:lang w:eastAsia="es-US"/>
-          <w14:ligatures w14:val="none"/>
-        </w:rPr>
-        <w:t xml:space="preserve"> de </w:t>
-      </w:r>
-      <w:r>
-        <w:rPr>
-          <w:rFonts w:ascii="Arial" w:eastAsia="Times New Roman" w:hAnsi="Arial" w:cs="Arial"/>
-          <w:color w:val="000000"/>
-          <w:kern w:val="0"/>
-          <w:lang w:eastAsia="es-US"/>
-          <w14:ligatures w14:val="none"/>
-        </w:rPr>
-        <w:t>mayo</w:t>
-      </w:r>
-      <w:r>
-        <w:rPr>
-          <w:rFonts w:ascii="Arial" w:eastAsia="Times New Roman" w:hAnsi="Arial" w:cs="Arial"/>
-          <w:color w:val="000000"/>
-          <w:kern w:val="0"/>
-          <w:lang w:eastAsia="es-US"/>
-          <w14:ligatures w14:val="none"/>
-        </w:rPr>
-        <w:t>, 2026</w:t>
+        <w:t>09 de mayo, 2026</w:t>
       </w:r>
       <w:r>
         <w:rPr>
@@ -1438,8 +1410,8 @@
           <w:szCs w:val="24"/>
         </w:rPr>
       </w:pPr>
-      <w:bookmarkStart w:id="0" w:name="_Toc228819737"/>
-      <w:bookmarkStart w:id="1" w:name="_Toc228819843"/>
+      <w:bookmarkStart w:id="1" w:name="_Toc228819737"/>
+      <w:bookmarkStart w:id="2" w:name="_Toc228819843"/>
       <w:r>
         <w:rPr>
           <w:rFonts w:ascii="Arial" w:hAnsi="Arial" w:cs="Arial"/>
@@ -1452,8 +1424,8 @@
         <w:lastRenderedPageBreak/>
         <w:t>INTRODUCCIÓN</w:t>
       </w:r>
-      <w:bookmarkEnd w:id="0"/>
       <w:bookmarkEnd w:id="1"/>
+      <w:bookmarkEnd w:id="2"/>
     </w:p>
     <w:p>
       <w:pPr>
@@ -1588,8 +1560,8 @@
           <w:szCs w:val="24"/>
         </w:rPr>
       </w:pPr>
-      <w:bookmarkStart w:id="2" w:name="_Toc228819739"/>
-      <w:bookmarkStart w:id="3" w:name="_Toc228819845"/>
+      <w:bookmarkStart w:id="3" w:name="_Toc228819739"/>
+      <w:bookmarkStart w:id="4" w:name="_Toc228819845"/>
       <w:r>
         <w:rPr>
           <w:rFonts w:ascii="Arial" w:hAnsi="Arial" w:cs="Arial"/>
@@ -1634,8 +1606,8 @@
         </w:rPr>
         <w:t>OBJETIVO GENERAL</w:t>
       </w:r>
-      <w:bookmarkEnd w:id="2"/>
       <w:bookmarkEnd w:id="3"/>
+      <w:bookmarkEnd w:id="4"/>
     </w:p>
     <w:p>
       <w:pPr>
@@ -1699,8 +1671,8 @@
           <w:szCs w:val="24"/>
         </w:rPr>
       </w:pPr>
-      <w:bookmarkStart w:id="4" w:name="_Toc228819740"/>
-      <w:bookmarkStart w:id="5" w:name="_Toc228819846"/>
+      <w:bookmarkStart w:id="5" w:name="_Toc228819740"/>
+      <w:bookmarkStart w:id="6" w:name="_Toc228819846"/>
       <w:r>
         <w:rPr>
           <w:rFonts w:ascii="Arial" w:hAnsi="Arial" w:cs="Arial"/>
@@ -1712,8 +1684,8 @@
         </w:rPr>
         <w:t>OBJETIVOS ESPECIFICOS</w:t>
       </w:r>
-      <w:bookmarkEnd w:id="4"/>
       <w:bookmarkEnd w:id="5"/>
+      <w:bookmarkEnd w:id="6"/>
     </w:p>
     <w:p>
       <w:pPr>
@@ -1885,8 +1857,8 @@
           <w:szCs w:val="24"/>
         </w:rPr>
       </w:pPr>
-      <w:bookmarkStart w:id="6" w:name="_Toc228819743"/>
-      <w:bookmarkStart w:id="7" w:name="_Toc228819849"/>
+      <w:bookmarkStart w:id="7" w:name="_Toc228819743"/>
+      <w:bookmarkStart w:id="8" w:name="_Toc228819849"/>
       <w:r>
         <w:rPr>
           <w:rFonts w:ascii="Arial" w:hAnsi="Arial" w:cs="Arial"/>
@@ -1899,8 +1871,8 @@
         <w:lastRenderedPageBreak/>
         <w:t>ALCANCE DE LA AUDITORIA</w:t>
       </w:r>
-      <w:bookmarkEnd w:id="6"/>
       <w:bookmarkEnd w:id="7"/>
+      <w:bookmarkEnd w:id="8"/>
     </w:p>
     <w:p>
       <w:pPr>
@@ -1970,7 +1942,21 @@
         <w:rPr>
           <w:rFonts w:ascii="Arial" w:hAnsi="Arial" w:cs="Arial"/>
         </w:rPr>
-        <w:t xml:space="preserve"> Evaluación del estado físico, capacidad operativa, antigüedad tecnológica y ubicación de los equipos centrales de conmutación (Dos Switches Principales </w:t>
+        <w:t xml:space="preserve"> Evaluación del estado físico, capacidad operativa, antigüedad tecnológica y ubicación de los equipos centrales de conmutación (Dos </w:t>
+      </w:r>
+      <w:proofErr w:type="spellStart"/>
+      <w:r>
+        <w:rPr>
+          <w:rFonts w:ascii="Arial" w:hAnsi="Arial" w:cs="Arial"/>
+        </w:rPr>
+        <w:t>Switches</w:t>
+      </w:r>
+      <w:proofErr w:type="spellEnd"/>
+      <w:r>
+        <w:rPr>
+          <w:rFonts w:ascii="Arial" w:hAnsi="Arial" w:cs="Arial"/>
+        </w:rPr>
+        <w:t xml:space="preserve"> Principales </w:t>
       </w:r>
       <w:proofErr w:type="spellStart"/>
       <w:r>
@@ -1984,7 +1970,21 @@
         <w:rPr>
           <w:rFonts w:ascii="Arial" w:hAnsi="Arial" w:cs="Arial"/>
         </w:rPr>
-        <w:t xml:space="preserve"> Ethernet de 24 puertos no administrables ubicados en Dirección y un Switch Secundario </w:t>
+        <w:t xml:space="preserve"> Ethernet de 24 puertos no administrables ubicados en Dirección y un </w:t>
+      </w:r>
+      <w:proofErr w:type="spellStart"/>
+      <w:r>
+        <w:rPr>
+          <w:rFonts w:ascii="Arial" w:hAnsi="Arial" w:cs="Arial"/>
+        </w:rPr>
+        <w:t>Switch</w:t>
+      </w:r>
+      <w:proofErr w:type="spellEnd"/>
+      <w:r>
+        <w:rPr>
+          <w:rFonts w:ascii="Arial" w:hAnsi="Arial" w:cs="Arial"/>
+        </w:rPr>
+        <w:t xml:space="preserve"> Secundario </w:t>
       </w:r>
       <w:proofErr w:type="spellStart"/>
       <w:r>
@@ -2133,7 +2133,21 @@
         <w:rPr>
           <w:rFonts w:ascii="Arial" w:hAnsi="Arial" w:cs="Arial"/>
         </w:rPr>
-        <w:t xml:space="preserve"> para el aislamiento de áreas críticas (Epidemiología, Banco Biológico, Estadística) respecto a áreas administrativas (Contabilidad, RRHH) y de uso compartido (Varios 1, 2 y 3), verificación de la velocidad de negociación de enlace limitada a 100 Mbps por los switches </w:t>
+        <w:t xml:space="preserve"> para el aislamiento de áreas críticas (Epidemiología, Banco Biológico, Estadística) respecto a áreas administrativas (Contabilidad, RRHH) y de uso compartido (Varios 1, 2 y 3), verificación de la velocidad de negociación de enlace limitada a 100 Mbps por los </w:t>
+      </w:r>
+      <w:proofErr w:type="spellStart"/>
+      <w:r>
+        <w:rPr>
+          <w:rFonts w:ascii="Arial" w:hAnsi="Arial" w:cs="Arial"/>
+        </w:rPr>
+        <w:t>switches</w:t>
+      </w:r>
+      <w:proofErr w:type="spellEnd"/>
+      <w:r>
+        <w:rPr>
+          <w:rFonts w:ascii="Arial" w:hAnsi="Arial" w:cs="Arial"/>
+        </w:rPr>
+        <w:t xml:space="preserve"> </w:t>
       </w:r>
       <w:proofErr w:type="spellStart"/>
       <w:r>
@@ -5329,8 +5343,8 @@
           <w:szCs w:val="24"/>
         </w:rPr>
       </w:pPr>
-      <w:bookmarkStart w:id="8" w:name="_Toc228819744"/>
-      <w:bookmarkStart w:id="9" w:name="_Toc228819850"/>
+      <w:bookmarkStart w:id="9" w:name="_Toc228819744"/>
+      <w:bookmarkStart w:id="10" w:name="_Toc228819850"/>
       <w:r>
         <w:rPr>
           <w:rFonts w:ascii="Arial" w:hAnsi="Arial" w:cs="Arial"/>
@@ -5343,8 +5357,8 @@
         <w:lastRenderedPageBreak/>
         <w:t>METODOLOGÍA DE LA AUDITORÍA</w:t>
       </w:r>
-      <w:bookmarkEnd w:id="8"/>
       <w:bookmarkEnd w:id="9"/>
+      <w:bookmarkEnd w:id="10"/>
     </w:p>
     <w:p>
       <w:pPr>
@@ -5390,7 +5404,21 @@
         <w:rPr>
           <w:rFonts w:ascii="Arial" w:hAnsi="Arial" w:cs="Arial"/>
         </w:rPr>
-        <w:t xml:space="preserve"> del SILAIS Masaya para contrastarlo con la documentación existente, identificando la interconexión de los dos switches </w:t>
+        <w:t xml:space="preserve"> del SILAIS Masaya para contrastarlo con la documentación existente, identificando la interconexión de los dos </w:t>
+      </w:r>
+      <w:proofErr w:type="spellStart"/>
+      <w:r>
+        <w:rPr>
+          <w:rFonts w:ascii="Arial" w:hAnsi="Arial" w:cs="Arial"/>
+        </w:rPr>
+        <w:t>switches</w:t>
+      </w:r>
+      <w:proofErr w:type="spellEnd"/>
+      <w:r>
+        <w:rPr>
+          <w:rFonts w:ascii="Arial" w:hAnsi="Arial" w:cs="Arial"/>
+        </w:rPr>
+        <w:t xml:space="preserve"> </w:t>
       </w:r>
       <w:proofErr w:type="spellStart"/>
       <w:r>
@@ -5461,7 +5489,21 @@
         <w:rPr>
           <w:rFonts w:ascii="Arial" w:hAnsi="Arial" w:cs="Arial"/>
         </w:rPr>
-        <w:t xml:space="preserve"> en el nodo central de comunicaciones ubicado en el área de Dirección (Switch Principal </w:t>
+        <w:t> en el nodo central de comunicaciones ubicado en el área de Dirección (</w:t>
+      </w:r>
+      <w:proofErr w:type="spellStart"/>
+      <w:r>
+        <w:rPr>
+          <w:rFonts w:ascii="Arial" w:hAnsi="Arial" w:cs="Arial"/>
+        </w:rPr>
+        <w:t>Switch</w:t>
+      </w:r>
+      <w:proofErr w:type="spellEnd"/>
+      <w:r>
+        <w:rPr>
+          <w:rFonts w:ascii="Arial" w:hAnsi="Arial" w:cs="Arial"/>
+        </w:rPr>
+        <w:t xml:space="preserve"> Principal </w:t>
       </w:r>
       <w:proofErr w:type="spellStart"/>
       <w:r>
@@ -5475,7 +5517,21 @@
         <w:rPr>
           <w:rFonts w:ascii="Arial" w:hAnsi="Arial" w:cs="Arial"/>
         </w:rPr>
-        <w:t xml:space="preserve"> Ethernet de 24 puertos) y en el punto de distribución secundario ubicado en el área de Varios 1 (Switch Secundario </w:t>
+        <w:t xml:space="preserve"> Ethernet de 24 puertos) y en el punto de distribución secundario ubicado en el área de Varios 1 (</w:t>
+      </w:r>
+      <w:proofErr w:type="spellStart"/>
+      <w:r>
+        <w:rPr>
+          <w:rFonts w:ascii="Arial" w:hAnsi="Arial" w:cs="Arial"/>
+        </w:rPr>
+        <w:t>Switch</w:t>
+      </w:r>
+      <w:proofErr w:type="spellEnd"/>
+      <w:r>
+        <w:rPr>
+          <w:rFonts w:ascii="Arial" w:hAnsi="Arial" w:cs="Arial"/>
+        </w:rPr>
+        <w:t xml:space="preserve"> Secundario </w:t>
       </w:r>
       <w:proofErr w:type="spellStart"/>
       <w:r>
@@ -5749,7 +5805,21 @@
         <w:rPr>
           <w:rFonts w:ascii="Arial" w:hAnsi="Arial" w:cs="Arial"/>
         </w:rPr>
-        <w:t xml:space="preserve">, propiedades del adaptador) para determinar la velocidad real de negociación de las tarjetas de red con los switches </w:t>
+        <w:t xml:space="preserve">, propiedades del adaptador) para determinar la velocidad real de negociación de las tarjetas de red con los </w:t>
+      </w:r>
+      <w:proofErr w:type="spellStart"/>
+      <w:r>
+        <w:rPr>
+          <w:rFonts w:ascii="Arial" w:hAnsi="Arial" w:cs="Arial"/>
+        </w:rPr>
+        <w:t>switches</w:t>
+      </w:r>
+      <w:proofErr w:type="spellEnd"/>
+      <w:r>
+        <w:rPr>
+          <w:rFonts w:ascii="Arial" w:hAnsi="Arial" w:cs="Arial"/>
+        </w:rPr>
+        <w:t xml:space="preserve"> </w:t>
       </w:r>
       <w:proofErr w:type="spellStart"/>
       <w:r>
@@ -6035,7 +6105,21 @@
         <w:rPr>
           <w:rFonts w:ascii="Arial" w:hAnsi="Arial" w:cs="Arial"/>
         </w:rPr>
-        <w:t xml:space="preserve"> de COBIT 2019, verificando si la Alta Dirección ha establecido un proceso formal para la identificación, análisis y tratamiento de los riesgos asociados a la infraestructura de red, particularmente aquellos relacionados con la obsolescencia tecnológica de los switches </w:t>
+        <w:t xml:space="preserve"> de COBIT 2019, verificando si la Alta Dirección ha establecido un proceso formal para la identificación, análisis y tratamiento de los riesgos asociados a la infraestructura de red, particularmente aquellos relacionados con la obsolescencia tecnológica de los </w:t>
+      </w:r>
+      <w:proofErr w:type="spellStart"/>
+      <w:r>
+        <w:rPr>
+          <w:rFonts w:ascii="Arial" w:hAnsi="Arial" w:cs="Arial"/>
+        </w:rPr>
+        <w:t>switches</w:t>
+      </w:r>
+      <w:proofErr w:type="spellEnd"/>
+      <w:r>
+        <w:rPr>
+          <w:rFonts w:ascii="Arial" w:hAnsi="Arial" w:cs="Arial"/>
+        </w:rPr>
+        <w:t xml:space="preserve"> </w:t>
       </w:r>
       <w:proofErr w:type="spellStart"/>
       <w:r>
@@ -7727,14 +7811,20 @@
                 <w:b/>
                 <w:bCs/>
               </w:rPr>
+              <w:t>Inmediata (0-15 días):</w:t>
+            </w:r>
+            <w:r>
+              <w:rPr>
+                <w:rFonts w:ascii="Arial" w:hAnsi="Arial" w:cs="Arial"/>
+              </w:rPr>
+              <w:t xml:space="preserve"> Adquirir e instalar un rack o gabinete de pared con cerradura en el área de </w:t>
+            </w:r>
+            <w:r>
+              <w:rPr>
+                <w:rFonts w:ascii="Arial" w:hAnsi="Arial" w:cs="Arial"/>
+              </w:rPr>
               <w:lastRenderedPageBreak/>
-              <w:t>Inmediata (0-15 días):</w:t>
-            </w:r>
-            <w:r>
-              <w:rPr>
-                <w:rFonts w:ascii="Arial" w:hAnsi="Arial" w:cs="Arial"/>
-              </w:rPr>
-              <w:t> Adquirir e instalar un rack o gabinete de pared con cerradura en el área de Varios 1 para alojar el switch secundario y su UPS.</w:t>
+              <w:t>Varios 1 para alojar el switch secundario y su UPS.</w:t>
             </w:r>
           </w:p>
           <w:p>
@@ -9107,8 +9197,14 @@
               <w:rPr>
                 <w:rFonts w:ascii="Arial" w:hAnsi="Arial" w:cs="Arial"/>
               </w:rPr>
+              <w:t xml:space="preserve">Corto plazo (30-60 días): Elaborar un programa de mantenimiento preventivo semestral que incluya limpieza interna y externa de switches, verificación del funcionamiento de ventiladores y </w:t>
+            </w:r>
+            <w:r>
+              <w:rPr>
+                <w:rFonts w:ascii="Arial" w:hAnsi="Arial" w:cs="Arial"/>
+              </w:rPr>
               <w:lastRenderedPageBreak/>
-              <w:t>Corto plazo (30-60 días): Elaborar un programa de mantenimiento preventivo semestral que incluya limpieza interna y externa de switches, verificación del funcionamiento de ventiladores y comprobación de la autonomía de las baterías de las UPS.</w:t>
+              <w:t>comprobación de la autonomía de las baterías de las UPS.</w:t>
             </w:r>
           </w:p>
           <w:p>
@@ -10423,7 +10519,6 @@
               <w:rPr>
                 <w:rFonts w:ascii="Arial" w:hAnsi="Arial" w:cs="Arial"/>
               </w:rPr>
-              <w:lastRenderedPageBreak/>
               <w:t>Corto plazo (30-60 días): Completar la instalación de canaletas plásticas en las diez áreas que carecen de protección.</w:t>
             </w:r>
           </w:p>
@@ -10470,7 +10565,14 @@
               <w:rPr>
                 <w:rFonts w:ascii="Arial" w:hAnsi="Arial" w:cs="Arial"/>
               </w:rPr>
-              <w:t xml:space="preserve"> de 24 puertos en ambos nodos y rosetas de pared en todas las áreas de trabajo.</w:t>
+              <w:t xml:space="preserve"> de 24 puertos en ambos nodos y rosetas de pared en todas las </w:t>
+            </w:r>
+            <w:r>
+              <w:rPr>
+                <w:rFonts w:ascii="Arial" w:hAnsi="Arial" w:cs="Arial"/>
+              </w:rPr>
+              <w:lastRenderedPageBreak/>
+              <w:t>áreas de trabajo.</w:t>
             </w:r>
           </w:p>
           <w:p>
@@ -11072,7 +11174,21 @@
               <w:rPr>
                 <w:rFonts w:ascii="Arial" w:hAnsi="Arial" w:cs="Arial"/>
               </w:rPr>
-              <w:t xml:space="preserve">La red LAN del SILAIS – Sede Masaya opera bajo una topología de red plana sin segmentación VLAN. Todas las áreas funcionales, incluyendo áreas críticas que manejan datos sensibles (Epidemiología, Banco Biológico), comparten el mismo dominio de broadcast con áreas administrativas y de uso compartido. Los switches </w:t>
+              <w:t xml:space="preserve">La red LAN del SILAIS – Sede Masaya opera bajo una topología de red plana sin segmentación VLAN. Todas las áreas funcionales, incluyendo áreas críticas que manejan datos sensibles (Epidemiología, Banco Biológico), comparten el mismo dominio de broadcast con áreas administrativas y de uso compartido. Los </w:t>
+            </w:r>
+            <w:proofErr w:type="spellStart"/>
+            <w:r>
+              <w:rPr>
+                <w:rFonts w:ascii="Arial" w:hAnsi="Arial" w:cs="Arial"/>
+              </w:rPr>
+              <w:t>switches</w:t>
+            </w:r>
+            <w:proofErr w:type="spellEnd"/>
+            <w:r>
+              <w:rPr>
+                <w:rFonts w:ascii="Arial" w:hAnsi="Arial" w:cs="Arial"/>
+              </w:rPr>
+              <w:t xml:space="preserve"> </w:t>
             </w:r>
             <w:proofErr w:type="spellStart"/>
             <w:r>
@@ -11156,7 +11272,21 @@
               <w:rPr>
                 <w:rFonts w:ascii="Arial" w:hAnsi="Arial" w:cs="Arial"/>
               </w:rPr>
-              <w:t xml:space="preserve">Obsolescencia tecnológica de los switches </w:t>
+              <w:t xml:space="preserve">Obsolescencia tecnológica de los </w:t>
+            </w:r>
+            <w:proofErr w:type="spellStart"/>
+            <w:r>
+              <w:rPr>
+                <w:rFonts w:ascii="Arial" w:hAnsi="Arial" w:cs="Arial"/>
+              </w:rPr>
+              <w:t>switches</w:t>
+            </w:r>
+            <w:proofErr w:type="spellEnd"/>
+            <w:r>
+              <w:rPr>
+                <w:rFonts w:ascii="Arial" w:hAnsi="Arial" w:cs="Arial"/>
+              </w:rPr>
+              <w:t xml:space="preserve"> </w:t>
             </w:r>
             <w:proofErr w:type="spellStart"/>
             <w:r>
@@ -11434,7 +11564,6 @@
               <w:rPr>
                 <w:rFonts w:ascii="Arial" w:hAnsi="Arial" w:cs="Arial"/>
               </w:rPr>
-              <w:lastRenderedPageBreak/>
               <w:t>VALORACIÓN DEL RIESGO</w:t>
             </w:r>
           </w:p>
@@ -11601,7 +11730,14 @@
                     <w:rPr>
                       <w:rFonts w:ascii="Arial" w:hAnsi="Arial" w:cs="Arial"/>
                     </w:rPr>
-                    <w:t>Nivel de Riesgo</w:t>
+                    <w:t xml:space="preserve">Nivel de </w:t>
+                  </w:r>
+                  <w:r>
+                    <w:rPr>
+                      <w:rFonts w:ascii="Arial" w:hAnsi="Arial" w:cs="Arial"/>
+                    </w:rPr>
+                    <w:lastRenderedPageBreak/>
+                    <w:t>Riesgo</w:t>
                   </w:r>
                 </w:p>
               </w:tc>
@@ -11640,6 +11776,7 @@
                     <w:rPr>
                       <w:rFonts w:ascii="Arial" w:hAnsi="Arial" w:cs="Arial"/>
                     </w:rPr>
+                    <w:lastRenderedPageBreak/>
                     <w:t xml:space="preserve">R-RED-002: Cifrado de datos SISNIVEN por </w:t>
                   </w:r>
                   <w:proofErr w:type="spellStart"/>
@@ -11799,6 +11936,7 @@
               <w:rPr>
                 <w:rFonts w:ascii="Arial" w:hAnsi="Arial" w:cs="Arial"/>
               </w:rPr>
+              <w:lastRenderedPageBreak/>
               <w:t>RECOMENDACIONES</w:t>
             </w:r>
           </w:p>
@@ -11830,13 +11968,27 @@
               <w:rPr>
                 <w:rFonts w:ascii="Arial" w:hAnsi="Arial" w:cs="Arial"/>
               </w:rPr>
-              <w:t xml:space="preserve">Prioritaria (30-60 días): Reemplazar los switches </w:t>
+              <w:t xml:space="preserve">Prioritaria (30-60 días): Reemplazar los </w:t>
             </w:r>
             <w:proofErr w:type="spellStart"/>
             <w:r>
               <w:rPr>
                 <w:rFonts w:ascii="Arial" w:hAnsi="Arial" w:cs="Arial"/>
               </w:rPr>
+              <w:t>switches</w:t>
+            </w:r>
+            <w:proofErr w:type="spellEnd"/>
+            <w:r>
+              <w:rPr>
+                <w:rFonts w:ascii="Arial" w:hAnsi="Arial" w:cs="Arial"/>
+              </w:rPr>
+              <w:t xml:space="preserve"> </w:t>
+            </w:r>
+            <w:proofErr w:type="spellStart"/>
+            <w:r>
+              <w:rPr>
+                <w:rFonts w:ascii="Arial" w:hAnsi="Arial" w:cs="Arial"/>
+              </w:rPr>
               <w:t>Fast</w:t>
             </w:r>
             <w:proofErr w:type="spellEnd"/>
@@ -11844,7 +11996,21 @@
               <w:rPr>
                 <w:rFonts w:ascii="Arial" w:hAnsi="Arial" w:cs="Arial"/>
               </w:rPr>
-              <w:t xml:space="preserve"> Ethernet por switches Gigabit administrables con soporte para </w:t>
+              <w:t xml:space="preserve"> Ethernet por </w:t>
+            </w:r>
+            <w:proofErr w:type="spellStart"/>
+            <w:r>
+              <w:rPr>
+                <w:rFonts w:ascii="Arial" w:hAnsi="Arial" w:cs="Arial"/>
+              </w:rPr>
+              <w:t>switches</w:t>
+            </w:r>
+            <w:proofErr w:type="spellEnd"/>
+            <w:r>
+              <w:rPr>
+                <w:rFonts w:ascii="Arial" w:hAnsi="Arial" w:cs="Arial"/>
+              </w:rPr>
+              <w:t xml:space="preserve"> Gigabit administrables con soporte para </w:t>
             </w:r>
             <w:proofErr w:type="spellStart"/>
             <w:r>
@@ -12760,7 +12926,21 @@
               <w:rPr>
                 <w:rFonts w:ascii="Arial" w:hAnsi="Arial" w:cs="Arial"/>
               </w:rPr>
-              <w:t>Riesgo de interceptación de tráfico sensible (Man-in-</w:t>
+              <w:t>Riesgo de interceptación de tráfico sensible (</w:t>
+            </w:r>
+            <w:proofErr w:type="spellStart"/>
+            <w:r>
+              <w:rPr>
+                <w:rFonts w:ascii="Arial" w:hAnsi="Arial" w:cs="Arial"/>
+              </w:rPr>
+              <w:t>Man</w:t>
+            </w:r>
+            <w:proofErr w:type="spellEnd"/>
+            <w:r>
+              <w:rPr>
+                <w:rFonts w:ascii="Arial" w:hAnsi="Arial" w:cs="Arial"/>
+              </w:rPr>
+              <w:t>-in-</w:t>
             </w:r>
             <w:proofErr w:type="spellStart"/>
             <w:r>
@@ -12814,7 +12994,6 @@
               <w:rPr>
                 <w:rFonts w:ascii="Arial" w:hAnsi="Arial" w:cs="Arial"/>
               </w:rPr>
-              <w:lastRenderedPageBreak/>
               <w:t>VALORACIÓN DEL RIESGO</w:t>
             </w:r>
           </w:p>
@@ -12993,7 +13172,18 @@
                       <w:lang w:eastAsia="es-US"/>
                       <w14:ligatures w14:val="none"/>
                     </w:rPr>
-                    <w:t>Nivel de Riesgo</w:t>
+                    <w:t xml:space="preserve">Nivel de </w:t>
+                  </w:r>
+                  <w:r>
+                    <w:rPr>
+                      <w:rFonts w:ascii="Arial" w:eastAsia="Times New Roman" w:hAnsi="Arial" w:cs="Arial"/>
+                      <w:color w:val="000000"/>
+                      <w:kern w:val="0"/>
+                      <w:lang w:eastAsia="es-US"/>
+                      <w14:ligatures w14:val="none"/>
+                    </w:rPr>
+                    <w:lastRenderedPageBreak/>
+                    <w:t>Riesgo</w:t>
                   </w:r>
                 </w:p>
               </w:tc>
@@ -13035,6 +13225,7 @@
                       <w:lang w:eastAsia="es-US"/>
                       <w14:ligatures w14:val="none"/>
                     </w:rPr>
+                    <w:lastRenderedPageBreak/>
                     <w:t xml:space="preserve">R-RED-004: Interceptación de credenciales y datos vía </w:t>
                   </w:r>
                   <w:proofErr w:type="spellStart"/>
@@ -13375,6 +13566,7 @@
               <w:rPr>
                 <w:rFonts w:ascii="Arial" w:hAnsi="Arial" w:cs="Arial"/>
               </w:rPr>
+              <w:lastRenderedPageBreak/>
               <w:t>RECOMENDACIONES</w:t>
             </w:r>
           </w:p>
@@ -14206,7 +14398,6 @@
               <w:rPr>
                 <w:rFonts w:ascii="Arial" w:hAnsi="Arial" w:cs="Arial"/>
               </w:rPr>
-              <w:lastRenderedPageBreak/>
               <w:t>Tiempos de respuesta y resolución de fallos excesivos y no controlados.</w:t>
             </w:r>
           </w:p>
@@ -14243,6 +14434,7 @@
               <w:rPr>
                 <w:rFonts w:ascii="Arial" w:hAnsi="Arial" w:cs="Arial"/>
               </w:rPr>
+              <w:lastRenderedPageBreak/>
               <w:t>Sensación de desamparo en los usuarios al no tener un canal claro de reporte.</w:t>
             </w:r>
           </w:p>
@@ -14269,6 +14461,7 @@
               <w:rPr>
                 <w:rFonts w:ascii="Arial" w:hAnsi="Arial" w:cs="Arial"/>
               </w:rPr>
+              <w:lastRenderedPageBreak/>
               <w:t>VALORACIÓN DEL RIESGO</w:t>
             </w:r>
           </w:p>
@@ -15412,7 +15605,6 @@
               <w:rPr>
                 <w:rFonts w:ascii="Arial" w:hAnsi="Arial" w:cs="Arial"/>
               </w:rPr>
-              <w:lastRenderedPageBreak/>
               <w:t>Ausencia de una política institucional de continuidad del negocio.</w:t>
             </w:r>
           </w:p>
@@ -15439,7 +15631,6 @@
               <w:rPr>
                 <w:rFonts w:ascii="Arial" w:hAnsi="Arial" w:cs="Arial"/>
               </w:rPr>
-              <w:lastRenderedPageBreak/>
               <w:t>IMPACTO</w:t>
             </w:r>
           </w:p>
@@ -15470,6 +15661,7 @@
               <w:rPr>
                 <w:rFonts w:ascii="Arial" w:hAnsi="Arial" w:cs="Arial"/>
               </w:rPr>
+              <w:lastRenderedPageBreak/>
               <w:t>Inexistencia de un responsable de TI que impulse la elaboración del plan.</w:t>
             </w:r>
           </w:p>
@@ -16119,7 +16311,7 @@
                     </pic:cNvPicPr>
                   </pic:nvPicPr>
                   <pic:blipFill>
-                    <a:blip r:embed="rId6" cstate="print">
+                    <a:blip r:embed="rId7" cstate="print">
                       <a:extLst>
                         <a:ext uri="{28A0092B-C50C-407E-A947-70E740481C1C}">
                           <a14:useLocalDpi xmlns:a14="http://schemas.microsoft.com/office/drawing/2010/main" val="0"/>
@@ -16265,15 +16457,7 @@
           <w:bCs/>
         </w:rPr>
         <w:lastRenderedPageBreak/>
-        <w:t xml:space="preserve">Anexo 2. </w:t>
-      </w:r>
-      <w:r>
-        <w:rPr>
-          <w:rFonts w:ascii="Arial" w:hAnsi="Arial" w:cs="Arial"/>
-          <w:b/>
-          <w:bCs/>
-        </w:rPr>
-        <w:t>Listado de verificación (</w:t>
+        <w:t>Anexo 2. Listado de verificación (</w:t>
       </w:r>
       <w:proofErr w:type="spellStart"/>
       <w:r>
@@ -17337,7 +17521,15 @@
             </w:r>
             <w:proofErr w:type="spellEnd"/>
             <w:r>
-              <w:t xml:space="preserve"> de diagnóstico de los switches (</w:t>
+              <w:t xml:space="preserve"> de diagnóstico de los </w:t>
+            </w:r>
+            <w:proofErr w:type="spellStart"/>
+            <w:r>
+              <w:t>switches</w:t>
+            </w:r>
+            <w:proofErr w:type="spellEnd"/>
+            <w:r>
+              <w:t xml:space="preserve"> (</w:t>
             </w:r>
             <w:proofErr w:type="spellStart"/>
             <w:r>
@@ -17500,12 +17692,12 @@
       </w:tblPr>
       <w:tblGrid>
         <w:gridCol w:w="949"/>
-        <w:gridCol w:w="2514"/>
-        <w:gridCol w:w="1426"/>
+        <w:gridCol w:w="2754"/>
+        <w:gridCol w:w="1427"/>
         <w:gridCol w:w="874"/>
         <w:gridCol w:w="794"/>
         <w:gridCol w:w="859"/>
-        <w:gridCol w:w="1934"/>
+        <w:gridCol w:w="1948"/>
       </w:tblGrid>
       <w:tr>
         <w:trPr>
@@ -17802,13 +17994,8 @@
           </w:tcPr>
           <w:p>
             <w:r>
-              <w:t xml:space="preserve">¿Las áreas de Banco Biológico, </w:t>
-            </w:r>
-            <w:proofErr w:type="gramStart"/>
-            <w:r>
-              <w:t>Sindicato, Dirección y FET Salud cuentan con canaletas plásticas instaladas?</w:t>
-            </w:r>
-            <w:proofErr w:type="gramEnd"/>
+              <w:t>¿Las áreas de Banco Biológico, Sindicato, Dirección y FET Salud cuentan con canaletas plásticas instaladas?</w:t>
+            </w:r>
           </w:p>
         </w:tc>
         <w:tc>
@@ -17934,17 +18121,8 @@
           </w:tcPr>
           <w:p>
             <w:r>
-              <w:t xml:space="preserve">¿Las 10 áreas funcionales restantes (Epidemiología, </w:t>
-            </w:r>
-            <w:proofErr w:type="gramStart"/>
-            <w:r>
-              <w:t xml:space="preserve">Varios 1, 2 y 3, Estadística, Contabilidad, RRHH, Insumos Médicos, Enfermería, Administración, Caja, SNC) cuentan con canaletas </w:t>
-            </w:r>
-            <w:r>
-              <w:lastRenderedPageBreak/>
-              <w:t>plásticas o tienen el cableado expuesto?</w:t>
-            </w:r>
-            <w:proofErr w:type="gramEnd"/>
+              <w:t>¿Las 10 áreas funcionales restantes (Epidemiología, Varios 1, 2 y 3, Estadística, Contabilidad, RRHH, Insumos Médicos, Enfermería, Administración, Caja, SNC) cuentan con canaletas plásticas o tienen el cableado expuesto?</w:t>
+            </w:r>
           </w:p>
         </w:tc>
         <w:tc>
@@ -17961,7 +18139,6 @@
           </w:tcPr>
           <w:p>
             <w:r>
-              <w:lastRenderedPageBreak/>
               <w:t>ANSI/TIA-569-C</w:t>
             </w:r>
           </w:p>
@@ -18053,6 +18230,7 @@
           </w:tcPr>
           <w:p>
             <w:r>
+              <w:lastRenderedPageBreak/>
               <w:t>C-04</w:t>
             </w:r>
           </w:p>
@@ -18452,14 +18630,18 @@
           </w:tcPr>
           <w:p>
             <w:r>
-              <w:t xml:space="preserve">¿Los cables están terminados directamente con </w:t>
-            </w:r>
-            <w:r>
-              <w:lastRenderedPageBreak/>
-              <w:t xml:space="preserve">conectores RJ45 macho hacia los switches, sin utilizar </w:t>
+              <w:t xml:space="preserve">¿Los cables están terminados directamente con conectores RJ45 macho hacia los </w:t>
             </w:r>
             <w:proofErr w:type="spellStart"/>
             <w:r>
+              <w:t>switches</w:t>
+            </w:r>
+            <w:proofErr w:type="spellEnd"/>
+            <w:r>
+              <w:t xml:space="preserve">, sin utilizar </w:t>
+            </w:r>
+            <w:proofErr w:type="spellStart"/>
+            <w:r>
               <w:t>Patch</w:t>
             </w:r>
             <w:proofErr w:type="spellEnd"/>
@@ -18490,7 +18672,6 @@
           </w:tcPr>
           <w:p>
             <w:r>
-              <w:lastRenderedPageBreak/>
               <w:t>ANSI/TIA-568-C</w:t>
             </w:r>
           </w:p>
@@ -18600,7 +18781,11 @@
           </w:tcPr>
           <w:p>
             <w:r>
-              <w:t xml:space="preserve">¿Se han realizado pruebas de continuidad con Cable </w:t>
+              <w:t xml:space="preserve">¿Se han realizado </w:t>
+            </w:r>
+            <w:r>
+              <w:lastRenderedPageBreak/>
+              <w:t xml:space="preserve">pruebas de continuidad con Cable </w:t>
             </w:r>
             <w:proofErr w:type="spellStart"/>
             <w:r>
@@ -18626,7 +18811,12 @@
           </w:tcPr>
           <w:p>
             <w:r>
-              <w:t>Mejores Prácticas</w:t>
+              <w:lastRenderedPageBreak/>
+              <w:t xml:space="preserve">Mejores </w:t>
+            </w:r>
+            <w:r>
+              <w:lastRenderedPageBreak/>
+              <w:t>Prácticas</w:t>
             </w:r>
           </w:p>
         </w:tc>
@@ -18644,6 +18834,7 @@
           </w:tcPr>
           <w:p>
             <w:r>
+              <w:lastRenderedPageBreak/>
               <w:t>[ ]</w:t>
             </w:r>
           </w:p>
@@ -18717,6 +18908,7 @@
           </w:tcPr>
           <w:p>
             <w:r>
+              <w:lastRenderedPageBreak/>
               <w:t>C-09</w:t>
             </w:r>
           </w:p>
@@ -18883,12 +19075,12 @@
       </w:tblPr>
       <w:tblGrid>
         <w:gridCol w:w="946"/>
-        <w:gridCol w:w="2603"/>
-        <w:gridCol w:w="1426"/>
+        <w:gridCol w:w="2843"/>
+        <w:gridCol w:w="1427"/>
         <w:gridCol w:w="792"/>
         <w:gridCol w:w="794"/>
         <w:gridCol w:w="859"/>
-        <w:gridCol w:w="1930"/>
+        <w:gridCol w:w="1944"/>
       </w:tblGrid>
       <w:tr>
         <w:trPr>
@@ -18909,7 +19101,6 @@
           </w:tcPr>
           <w:p>
             <w:r>
-              <w:lastRenderedPageBreak/>
               <w:t>ID</w:t>
             </w:r>
           </w:p>
@@ -19176,6 +19367,7 @@
           </w:tcPr>
           <w:p>
             <w:r>
+              <w:lastRenderedPageBreak/>
               <w:t>E-02</w:t>
             </w:r>
           </w:p>
@@ -19472,11 +19664,7 @@
           </w:tcPr>
           <w:p>
             <w:r>
-              <w:t xml:space="preserve">¿Los puntos de red en las áreas de trabajo están etiquetados formalmente con una nomenclatura que </w:t>
-            </w:r>
-            <w:r>
-              <w:lastRenderedPageBreak/>
-              <w:t>permita identificar su ubicación en el switch o área correspondiente?</w:t>
+              <w:t>¿Los puntos de red en las áreas de trabajo están etiquetados formalmente con una nomenclatura que permita identificar su ubicación en el switch o área correspondiente?</w:t>
             </w:r>
           </w:p>
         </w:tc>
@@ -19494,7 +19682,6 @@
           </w:tcPr>
           <w:p>
             <w:r>
-              <w:lastRenderedPageBreak/>
               <w:t>ANSI/TIA-606-B</w:t>
             </w:r>
           </w:p>
@@ -19604,7 +19791,11 @@
           </w:tcPr>
           <w:p>
             <w:r>
-              <w:t xml:space="preserve">¿Los 46 equipos de escritorio y 5 laptops tienen acceso físico a un punto de red o dependen exclusivamente de conectividad </w:t>
+              <w:t xml:space="preserve">¿Los 46 equipos de escritorio y 5 laptops tienen acceso físico a un punto de red o dependen exclusivamente de </w:t>
+            </w:r>
+            <w:r>
+              <w:lastRenderedPageBreak/>
+              <w:t xml:space="preserve">conectividad </w:t>
             </w:r>
             <w:proofErr w:type="spellStart"/>
             <w:r>
@@ -19630,6 +19821,7 @@
           </w:tcPr>
           <w:p>
             <w:r>
+              <w:lastRenderedPageBreak/>
               <w:t>Mejores Prácticas</w:t>
             </w:r>
           </w:p>
@@ -19721,6 +19913,7 @@
           </w:tcPr>
           <w:p>
             <w:r>
+              <w:lastRenderedPageBreak/>
               <w:t>E-06</w:t>
             </w:r>
           </w:p>
@@ -19747,11 +19940,7 @@
             </w:r>
             <w:proofErr w:type="spellEnd"/>
             <w:r>
-              <w:t xml:space="preserve">), </w:t>
-            </w:r>
-            <w:proofErr w:type="gramStart"/>
-            <w:r>
-              <w:t xml:space="preserve">Contabilidad (3 equipos </w:t>
+              <w:t xml:space="preserve">), Contabilidad (3 equipos </w:t>
             </w:r>
             <w:proofErr w:type="spellStart"/>
             <w:r>
@@ -19785,7 +19974,6 @@
             <w:r>
               <w:t>) cuentan con puntos de red cableada como respaldo?</w:t>
             </w:r>
-            <w:proofErr w:type="gramEnd"/>
           </w:p>
         </w:tc>
         <w:tc>
@@ -19926,12 +20114,12 @@
       </w:tblPr>
       <w:tblGrid>
         <w:gridCol w:w="948"/>
-        <w:gridCol w:w="2591"/>
+        <w:gridCol w:w="2833"/>
         <w:gridCol w:w="1435"/>
         <w:gridCol w:w="794"/>
         <w:gridCol w:w="794"/>
         <w:gridCol w:w="859"/>
-        <w:gridCol w:w="1929"/>
+        <w:gridCol w:w="1942"/>
       </w:tblGrid>
       <w:tr>
         <w:trPr>
@@ -19952,7 +20140,6 @@
           </w:tcPr>
           <w:p>
             <w:r>
-              <w:lastRenderedPageBreak/>
               <w:t>ID</w:t>
             </w:r>
           </w:p>
@@ -20102,7 +20289,15 @@
           </w:tcPr>
           <w:p>
             <w:r>
-              <w:t xml:space="preserve">¿Los switches </w:t>
+              <w:t xml:space="preserve">¿Los </w:t>
+            </w:r>
+            <w:proofErr w:type="spellStart"/>
+            <w:r>
+              <w:t>switches</w:t>
+            </w:r>
+            <w:proofErr w:type="spellEnd"/>
+            <w:r>
+              <w:t xml:space="preserve"> </w:t>
             </w:r>
             <w:proofErr w:type="spellStart"/>
             <w:r>
@@ -20235,6 +20430,7 @@
           </w:tcPr>
           <w:p>
             <w:r>
+              <w:lastRenderedPageBreak/>
               <w:t>S-02</w:t>
             </w:r>
           </w:p>
@@ -20261,13 +20457,8 @@
             </w:r>
             <w:proofErr w:type="spellEnd"/>
             <w:r>
-              <w:t xml:space="preserve">) para separar el tráfico de datos sensibles (Epidemiología, </w:t>
-            </w:r>
-            <w:proofErr w:type="gramStart"/>
-            <w:r>
-              <w:t>Banco Biológico) del tráfico administrativo (Contabilidad, RRHH) y del tráfico de áreas de uso compartido (Varios 1, 2 y 3)?</w:t>
-            </w:r>
-            <w:proofErr w:type="gramEnd"/>
+              <w:t>) para separar el tráfico de datos sensibles (Epidemiología, Banco Biológico) del tráfico administrativo (Contabilidad, RRHH) y del tráfico de áreas de uso compartido (Varios 1, 2 y 3)?</w:t>
+            </w:r>
           </w:p>
         </w:tc>
         <w:tc>
@@ -20502,7 +20693,6 @@
           </w:tcPr>
           <w:p>
             <w:r>
-              <w:lastRenderedPageBreak/>
               <w:t>S-04</w:t>
             </w:r>
           </w:p>
@@ -20521,7 +20711,15 @@
           </w:tcPr>
           <w:p>
             <w:r>
-              <w:t xml:space="preserve">¿Se ha verificado la velocidad de negociación de los enlaces en los equipos de cómputo, confirmando que operan a 100 Mbps debido a la limitación de los switches </w:t>
+              <w:t xml:space="preserve">¿Se ha verificado la velocidad de negociación de los enlaces en los equipos de cómputo, confirmando que operan a 100 Mbps debido a la limitación de los </w:t>
+            </w:r>
+            <w:proofErr w:type="spellStart"/>
+            <w:r>
+              <w:t>switches</w:t>
+            </w:r>
+            <w:proofErr w:type="spellEnd"/>
+            <w:r>
+              <w:t xml:space="preserve"> </w:t>
             </w:r>
             <w:proofErr w:type="spellStart"/>
             <w:r>
@@ -20656,7 +20854,11 @@
           </w:tcPr>
           <w:p>
             <w:r>
-              <w:t>¿El direccionamiento IP está correctamente configurado mediante DHCP o asignación estática documentada para todas las áreas?</w:t>
+              <w:t xml:space="preserve">¿El direccionamiento IP está correctamente </w:t>
+            </w:r>
+            <w:r>
+              <w:lastRenderedPageBreak/>
+              <w:t>configurado mediante DHCP o asignación estática documentada para todas las áreas?</w:t>
             </w:r>
           </w:p>
         </w:tc>
@@ -20674,6 +20876,7 @@
           </w:tcPr>
           <w:p>
             <w:r>
+              <w:lastRenderedPageBreak/>
               <w:t>Mejores Prácticas</w:t>
             </w:r>
           </w:p>
@@ -20765,6 +20968,7 @@
           </w:tcPr>
           <w:p>
             <w:r>
+              <w:lastRenderedPageBreak/>
               <w:t>S-06</w:t>
             </w:r>
           </w:p>
@@ -20900,7 +21104,6 @@
           </w:tcPr>
           <w:p>
             <w:r>
-              <w:lastRenderedPageBreak/>
               <w:t>S-07</w:t>
             </w:r>
           </w:p>
@@ -21189,7 +21392,11 @@
           </w:tcPr>
           <w:p>
             <w:r>
-              <w:t>¿Las conexiones privadas a Internet en Sindicato, SNC y Transporte están documentadas, autorizadas y cuentan con medidas de seguridad para prevenir fuga de información institucional?</w:t>
+              <w:t xml:space="preserve">¿Las conexiones </w:t>
+            </w:r>
+            <w:r>
+              <w:lastRenderedPageBreak/>
+              <w:t>privadas a Internet en Sindicato, SNC y Transporte están documentadas, autorizadas y cuentan con medidas de seguridad para prevenir fuga de información institucional?</w:t>
             </w:r>
           </w:p>
         </w:tc>
@@ -21207,7 +21414,12 @@
           </w:tcPr>
           <w:p>
             <w:r>
-              <w:t>ISO 27001 (A.13.1.1)</w:t>
+              <w:lastRenderedPageBreak/>
+              <w:t xml:space="preserve">ISO </w:t>
+            </w:r>
+            <w:r>
+              <w:lastRenderedPageBreak/>
+              <w:t>27001 (A.13.1.1)</w:t>
             </w:r>
           </w:p>
         </w:tc>
@@ -21225,6 +21437,7 @@
           </w:tcPr>
           <w:p>
             <w:r>
+              <w:lastRenderedPageBreak/>
               <w:t>[ ]</w:t>
             </w:r>
           </w:p>
@@ -21303,7 +21516,6 @@
           <w:b/>
           <w:bCs/>
         </w:rPr>
-        <w:lastRenderedPageBreak/>
         <w:t>Referencia Normativa:</w:t>
       </w:r>
       <w:r>
@@ -21332,12 +21544,12 @@
       </w:tblPr>
       <w:tblGrid>
         <w:gridCol w:w="865"/>
-        <w:gridCol w:w="2589"/>
+        <w:gridCol w:w="2827"/>
         <w:gridCol w:w="1435"/>
         <w:gridCol w:w="861"/>
         <w:gridCol w:w="794"/>
         <w:gridCol w:w="859"/>
-        <w:gridCol w:w="1947"/>
+        <w:gridCol w:w="1964"/>
       </w:tblGrid>
       <w:tr>
         <w:trPr>
@@ -21633,13 +21845,8 @@
             <w:hideMark/>
           </w:tcPr>
           <w:p>
-            <w:proofErr w:type="gramStart"/>
-            <w:r>
-              <w:t>¿Se ha implementado control de acceso a la red mediante autenticación 802.</w:t>
-            </w:r>
-            <w:proofErr w:type="gramEnd"/>
-            <w:r>
-              <w:t>1X o seguridad de puertos en los switches?</w:t>
+            <w:r>
+              <w:t>¿Se ha implementado control de acceso a la red mediante autenticación 802.1X o seguridad de puertos en los switches?</w:t>
             </w:r>
           </w:p>
         </w:tc>
@@ -21748,6 +21955,7 @@
           </w:tcPr>
           <w:p>
             <w:r>
+              <w:lastRenderedPageBreak/>
               <w:t>G-03</w:t>
             </w:r>
           </w:p>
@@ -21875,7 +22083,6 @@
           </w:tcPr>
           <w:p>
             <w:r>
-              <w:lastRenderedPageBreak/>
               <w:t>G-04</w:t>
             </w:r>
           </w:p>
@@ -22731,13 +22938,8 @@
           </w:tcPr>
           <w:p>
             <w:r>
-              <w:t xml:space="preserve">¿El inventario incluye información sobre: </w:t>
-            </w:r>
-            <w:proofErr w:type="gramStart"/>
-            <w:r>
-              <w:t>marca, modelo, número de serie, fecha de adquisición, estado de garantía y ubicación física de cada activo de red?</w:t>
-            </w:r>
-            <w:proofErr w:type="gramEnd"/>
+              <w:t>¿El inventario incluye información sobre: marca, modelo, número de serie, fecha de adquisición, estado de garantía y ubicación física de cada activo de red?</w:t>
+            </w:r>
           </w:p>
         </w:tc>
         <w:tc>
@@ -23124,7 +23326,15 @@
           </w:tcPr>
           <w:p>
             <w:r>
-              <w:t xml:space="preserve">¿Se ha documentado la antigüedad y el ciclo de vida estimado de los switches </w:t>
+              <w:t xml:space="preserve">¿Se ha documentado la antigüedad y el ciclo de vida estimado de los </w:t>
+            </w:r>
+            <w:proofErr w:type="spellStart"/>
+            <w:r>
+              <w:t>switches</w:t>
+            </w:r>
+            <w:proofErr w:type="spellEnd"/>
+            <w:r>
+              <w:t xml:space="preserve"> </w:t>
             </w:r>
             <w:proofErr w:type="spellStart"/>
             <w:r>
@@ -23442,31 +23652,7 @@
           <w:bCs/>
         </w:rPr>
         <w:lastRenderedPageBreak/>
-        <w:t xml:space="preserve">Anexo </w:t>
-      </w:r>
-      <w:r>
-        <w:rPr>
-          <w:rFonts w:ascii="Arial" w:hAnsi="Arial" w:cs="Arial"/>
-          <w:b/>
-          <w:bCs/>
-        </w:rPr>
-        <w:t>3</w:t>
-      </w:r>
-      <w:r>
-        <w:rPr>
-          <w:rFonts w:ascii="Arial" w:hAnsi="Arial" w:cs="Arial"/>
-          <w:b/>
-          <w:bCs/>
-        </w:rPr>
-        <w:t xml:space="preserve">. </w:t>
-      </w:r>
-      <w:r>
-        <w:rPr>
-          <w:rFonts w:ascii="Arial" w:hAnsi="Arial" w:cs="Arial"/>
-          <w:b/>
-          <w:bCs/>
-        </w:rPr>
-        <w:t>Evidencias de auditoria</w:t>
+        <w:t>Anexo 3. Evidencias de auditoria</w:t>
       </w:r>
     </w:p>
     <w:p>
@@ -23492,6 +23678,7 @@
           <w:b/>
           <w:bCs/>
           <w:noProof/>
+          <w:lang w:eastAsia="es-US"/>
         </w:rPr>
         <w:drawing>
           <wp:inline distT="0" distB="0" distL="0" distR="0" wp14:anchorId="5CC21008" wp14:editId="67D077D6">
@@ -23506,179 +23693,6 @@
                 <pic:pic xmlns:pic="http://schemas.openxmlformats.org/drawingml/2006/picture">
                   <pic:nvPicPr>
                     <pic:cNvPr id="2" name="Imagen 2"/>
-                    <pic:cNvPicPr/>
-                  </pic:nvPicPr>
-                  <pic:blipFill>
-                    <a:blip r:embed="rId7" cstate="print">
-                      <a:extLst>
-                        <a:ext uri="{28A0092B-C50C-407E-A947-70E740481C1C}">
-                          <a14:useLocalDpi xmlns:a14="http://schemas.microsoft.com/office/drawing/2010/main" val="0"/>
-                        </a:ext>
-                      </a:extLst>
-                    </a:blip>
-                    <a:stretch>
-                      <a:fillRect/>
-                    </a:stretch>
-                  </pic:blipFill>
-                  <pic:spPr>
-                    <a:xfrm>
-                      <a:off x="0" y="0"/>
-                      <a:ext cx="5943600" cy="4457700"/>
-                    </a:xfrm>
-                    <a:prstGeom prst="rect">
-                      <a:avLst/>
-                    </a:prstGeom>
-                  </pic:spPr>
-                </pic:pic>
-              </a:graphicData>
-            </a:graphic>
-          </wp:inline>
-        </w:drawing>
-      </w:r>
-    </w:p>
-    <w:p>
-      <w:pPr>
-        <w:rPr>
-          <w:rFonts w:ascii="Arial" w:hAnsi="Arial" w:cs="Arial"/>
-        </w:rPr>
-      </w:pPr>
-      <w:r>
-        <w:rPr>
-          <w:rFonts w:ascii="Arial" w:hAnsi="Arial" w:cs="Arial"/>
-          <w:b/>
-          <w:bCs/>
-        </w:rPr>
-        <w:t xml:space="preserve">Imagen 1. </w:t>
-      </w:r>
-      <w:r>
-        <w:rPr>
-          <w:rFonts w:ascii="Arial" w:hAnsi="Arial" w:cs="Arial"/>
-        </w:rPr>
-        <w:t xml:space="preserve">Los dos switches principales ubicados en el área de Dirección </w:t>
-      </w:r>
-      <w:r>
-        <w:rPr>
-          <w:rFonts w:ascii="Arial" w:hAnsi="Arial" w:cs="Arial"/>
-        </w:rPr>
-        <w:t>no cuentan con un</w:t>
-      </w:r>
-      <w:r>
-        <w:rPr>
-          <w:rFonts w:ascii="Arial" w:hAnsi="Arial" w:cs="Arial"/>
-        </w:rPr>
-        <w:t xml:space="preserve"> con un Rack</w:t>
-      </w:r>
-      <w:r>
-        <w:rPr>
-          <w:rFonts w:ascii="Arial" w:hAnsi="Arial" w:cs="Arial"/>
-          <w:b/>
-          <w:bCs/>
-        </w:rPr>
-        <w:t xml:space="preserve"> </w:t>
-      </w:r>
-      <w:r>
-        <w:rPr>
-          <w:rFonts w:ascii="Arial" w:hAnsi="Arial" w:cs="Arial"/>
-        </w:rPr>
-        <w:t xml:space="preserve">ni con un </w:t>
-      </w:r>
-      <w:proofErr w:type="spellStart"/>
-      <w:r>
-        <w:rPr>
-          <w:rFonts w:ascii="Arial" w:hAnsi="Arial" w:cs="Arial"/>
-        </w:rPr>
-        <w:t>patch</w:t>
-      </w:r>
-      <w:proofErr w:type="spellEnd"/>
-      <w:r>
-        <w:rPr>
-          <w:rFonts w:ascii="Arial" w:hAnsi="Arial" w:cs="Arial"/>
-        </w:rPr>
-        <w:t xml:space="preserve"> panel. </w:t>
-      </w:r>
-    </w:p>
-    <w:p>
-      <w:pPr>
-        <w:rPr>
-          <w:rFonts w:ascii="Arial" w:hAnsi="Arial" w:cs="Arial"/>
-        </w:rPr>
-      </w:pPr>
-    </w:p>
-    <w:p>
-      <w:pPr>
-        <w:rPr>
-          <w:rFonts w:ascii="Arial" w:hAnsi="Arial" w:cs="Arial"/>
-        </w:rPr>
-      </w:pPr>
-    </w:p>
-    <w:p>
-      <w:pPr>
-        <w:rPr>
-          <w:rFonts w:ascii="Arial" w:hAnsi="Arial" w:cs="Arial"/>
-        </w:rPr>
-      </w:pPr>
-    </w:p>
-    <w:p>
-      <w:pPr>
-        <w:rPr>
-          <w:rFonts w:ascii="Arial" w:hAnsi="Arial" w:cs="Arial"/>
-        </w:rPr>
-      </w:pPr>
-    </w:p>
-    <w:p>
-      <w:pPr>
-        <w:rPr>
-          <w:rFonts w:ascii="Arial" w:hAnsi="Arial" w:cs="Arial"/>
-        </w:rPr>
-      </w:pPr>
-    </w:p>
-    <w:p>
-      <w:pPr>
-        <w:rPr>
-          <w:rFonts w:ascii="Arial" w:hAnsi="Arial" w:cs="Arial"/>
-        </w:rPr>
-      </w:pPr>
-    </w:p>
-    <w:p>
-      <w:pPr>
-        <w:rPr>
-          <w:rFonts w:ascii="Arial" w:hAnsi="Arial" w:cs="Arial"/>
-        </w:rPr>
-      </w:pPr>
-    </w:p>
-    <w:p>
-      <w:pPr>
-        <w:rPr>
-          <w:rFonts w:ascii="Arial" w:hAnsi="Arial" w:cs="Arial"/>
-        </w:rPr>
-      </w:pPr>
-    </w:p>
-    <w:p>
-      <w:pPr>
-        <w:rPr>
-          <w:rFonts w:ascii="Arial" w:hAnsi="Arial" w:cs="Arial"/>
-          <w:noProof/>
-        </w:rPr>
-      </w:pPr>
-      <w:r>
-        <w:rPr>
-          <w:rFonts w:ascii="Arial" w:hAnsi="Arial" w:cs="Arial"/>
-          <w:noProof/>
-        </w:rPr>
-        <w:lastRenderedPageBreak/>
-        <w:drawing>
-          <wp:inline distT="0" distB="0" distL="0" distR="0" wp14:anchorId="0E7E7D98" wp14:editId="1D43915C">
-            <wp:extent cx="5943600" cy="4457700"/>
-            <wp:effectExtent l="0" t="0" r="0" b="0"/>
-            <wp:docPr id="4" name="Imagen 4"/>
-            <wp:cNvGraphicFramePr>
-              <a:graphicFrameLocks xmlns:a="http://schemas.openxmlformats.org/drawingml/2006/main" noChangeAspect="1"/>
-            </wp:cNvGraphicFramePr>
-            <a:graphic xmlns:a="http://schemas.openxmlformats.org/drawingml/2006/main">
-              <a:graphicData uri="http://schemas.openxmlformats.org/drawingml/2006/picture">
-                <pic:pic xmlns:pic="http://schemas.openxmlformats.org/drawingml/2006/picture">
-                  <pic:nvPicPr>
-                    <pic:cNvPr id="4" name="Imagen 4"/>
                     <pic:cNvPicPr/>
                   </pic:nvPicPr>
                   <pic:blipFill>
@@ -23721,23 +23735,181 @@
           <w:b/>
           <w:bCs/>
         </w:rPr>
-        <w:t xml:space="preserve">Imagen </w:t>
+        <w:t xml:space="preserve">Imagen 1. </w:t>
       </w:r>
       <w:r>
         <w:rPr>
           <w:rFonts w:ascii="Arial" w:hAnsi="Arial" w:cs="Arial"/>
+        </w:rPr>
+        <w:t xml:space="preserve">Los dos switches principales ubicados en el área de Dirección </w:t>
+      </w:r>
+      <w:r>
+        <w:rPr>
+          <w:rFonts w:ascii="Arial" w:hAnsi="Arial" w:cs="Arial"/>
+        </w:rPr>
+        <w:t>no cuentan con un</w:t>
+      </w:r>
+      <w:r>
+        <w:rPr>
+          <w:rFonts w:ascii="Arial" w:hAnsi="Arial" w:cs="Arial"/>
+        </w:rPr>
+        <w:t xml:space="preserve"> con un Rack</w:t>
+      </w:r>
+      <w:r>
+        <w:rPr>
+          <w:rFonts w:ascii="Arial" w:hAnsi="Arial" w:cs="Arial"/>
           <w:b/>
           <w:bCs/>
         </w:rPr>
-        <w:t>2</w:t>
+        <w:t xml:space="preserve"> </w:t>
       </w:r>
       <w:r>
         <w:rPr>
           <w:rFonts w:ascii="Arial" w:hAnsi="Arial" w:cs="Arial"/>
+        </w:rPr>
+        <w:t xml:space="preserve">ni con un </w:t>
+      </w:r>
+      <w:proofErr w:type="spellStart"/>
+      <w:r>
+        <w:rPr>
+          <w:rFonts w:ascii="Arial" w:hAnsi="Arial" w:cs="Arial"/>
+        </w:rPr>
+        <w:t>patch</w:t>
+      </w:r>
+      <w:proofErr w:type="spellEnd"/>
+      <w:r>
+        <w:rPr>
+          <w:rFonts w:ascii="Arial" w:hAnsi="Arial" w:cs="Arial"/>
+        </w:rPr>
+        <w:t xml:space="preserve"> panel. </w:t>
+      </w:r>
+    </w:p>
+    <w:p>
+      <w:pPr>
+        <w:rPr>
+          <w:rFonts w:ascii="Arial" w:hAnsi="Arial" w:cs="Arial"/>
+        </w:rPr>
+      </w:pPr>
+    </w:p>
+    <w:p>
+      <w:pPr>
+        <w:rPr>
+          <w:rFonts w:ascii="Arial" w:hAnsi="Arial" w:cs="Arial"/>
+        </w:rPr>
+      </w:pPr>
+    </w:p>
+    <w:p>
+      <w:pPr>
+        <w:rPr>
+          <w:rFonts w:ascii="Arial" w:hAnsi="Arial" w:cs="Arial"/>
+        </w:rPr>
+      </w:pPr>
+    </w:p>
+    <w:p>
+      <w:pPr>
+        <w:rPr>
+          <w:rFonts w:ascii="Arial" w:hAnsi="Arial" w:cs="Arial"/>
+        </w:rPr>
+      </w:pPr>
+    </w:p>
+    <w:p>
+      <w:pPr>
+        <w:rPr>
+          <w:rFonts w:ascii="Arial" w:hAnsi="Arial" w:cs="Arial"/>
+        </w:rPr>
+      </w:pPr>
+    </w:p>
+    <w:p>
+      <w:pPr>
+        <w:rPr>
+          <w:rFonts w:ascii="Arial" w:hAnsi="Arial" w:cs="Arial"/>
+        </w:rPr>
+      </w:pPr>
+    </w:p>
+    <w:p>
+      <w:pPr>
+        <w:rPr>
+          <w:rFonts w:ascii="Arial" w:hAnsi="Arial" w:cs="Arial"/>
+        </w:rPr>
+      </w:pPr>
+    </w:p>
+    <w:p>
+      <w:pPr>
+        <w:rPr>
+          <w:rFonts w:ascii="Arial" w:hAnsi="Arial" w:cs="Arial"/>
+        </w:rPr>
+      </w:pPr>
+    </w:p>
+    <w:p>
+      <w:pPr>
+        <w:rPr>
+          <w:rFonts w:ascii="Arial" w:hAnsi="Arial" w:cs="Arial"/>
+          <w:noProof/>
+        </w:rPr>
+      </w:pPr>
+      <w:r>
+        <w:rPr>
+          <w:rFonts w:ascii="Arial" w:hAnsi="Arial" w:cs="Arial"/>
+          <w:noProof/>
+          <w:lang w:eastAsia="es-US"/>
+        </w:rPr>
+        <w:lastRenderedPageBreak/>
+        <w:drawing>
+          <wp:inline distT="0" distB="0" distL="0" distR="0" wp14:anchorId="0E7E7D98" wp14:editId="1D43915C">
+            <wp:extent cx="5943600" cy="4457700"/>
+            <wp:effectExtent l="0" t="0" r="0" b="0"/>
+            <wp:docPr id="4" name="Imagen 4"/>
+            <wp:cNvGraphicFramePr>
+              <a:graphicFrameLocks xmlns:a="http://schemas.openxmlformats.org/drawingml/2006/main" noChangeAspect="1"/>
+            </wp:cNvGraphicFramePr>
+            <a:graphic xmlns:a="http://schemas.openxmlformats.org/drawingml/2006/main">
+              <a:graphicData uri="http://schemas.openxmlformats.org/drawingml/2006/picture">
+                <pic:pic xmlns:pic="http://schemas.openxmlformats.org/drawingml/2006/picture">
+                  <pic:nvPicPr>
+                    <pic:cNvPr id="4" name="Imagen 4"/>
+                    <pic:cNvPicPr/>
+                  </pic:nvPicPr>
+                  <pic:blipFill>
+                    <a:blip r:embed="rId9" cstate="print">
+                      <a:extLst>
+                        <a:ext uri="{28A0092B-C50C-407E-A947-70E740481C1C}">
+                          <a14:useLocalDpi xmlns:a14="http://schemas.microsoft.com/office/drawing/2010/main" val="0"/>
+                        </a:ext>
+                      </a:extLst>
+                    </a:blip>
+                    <a:stretch>
+                      <a:fillRect/>
+                    </a:stretch>
+                  </pic:blipFill>
+                  <pic:spPr>
+                    <a:xfrm>
+                      <a:off x="0" y="0"/>
+                      <a:ext cx="5943600" cy="4457700"/>
+                    </a:xfrm>
+                    <a:prstGeom prst="rect">
+                      <a:avLst/>
+                    </a:prstGeom>
+                  </pic:spPr>
+                </pic:pic>
+              </a:graphicData>
+            </a:graphic>
+          </wp:inline>
+        </w:drawing>
+      </w:r>
+    </w:p>
+    <w:p>
+      <w:pPr>
+        <w:rPr>
+          <w:rFonts w:ascii="Arial" w:hAnsi="Arial" w:cs="Arial"/>
+        </w:rPr>
+      </w:pPr>
+      <w:r>
+        <w:rPr>
+          <w:rFonts w:ascii="Arial" w:hAnsi="Arial" w:cs="Arial"/>
           <w:b/>
           <w:bCs/>
         </w:rPr>
-        <w:t xml:space="preserve">. </w:t>
+        <w:t xml:space="preserve">Imagen 2. </w:t>
       </w:r>
       <w:r>
         <w:rPr>
@@ -23880,8 +24052,8 @@
 </file>
 
 <file path=word/numbering.xml><?xml version="1.0" encoding="utf-8"?>
-<w:numbering xmlns:wpc="http://schemas.microsoft.com/office/word/2010/wordprocessingCanvas" xmlns:cx="http://schemas.microsoft.com/office/drawing/2014/chartex" xmlns:cx1="http://schemas.microsoft.com/office/drawing/2015/9/8/chartex" xmlns:cx2="http://schemas.microsoft.com/office/drawing/2015/10/21/chartex" xmlns:cx3="http://schemas.microsoft.com/office/drawing/2016/5/9/chartex" xmlns:cx4="http://schemas.microsoft.com/office/drawing/2016/5/10/chartex" xmlns:cx5="http://schemas.microsoft.com/office/drawing/2016/5/11/chartex" xmlns:cx6="http://schemas.microsoft.com/office/drawing/2016/5/12/chartex" xmlns:cx7="http://schemas.microsoft.com/office/drawing/2016/5/13/chartex" xmlns:cx8="http://schemas.microsoft.com/office/drawing/2016/5/14/chartex" xmlns:mc="http://schemas.openxmlformats.org/markup-compatibility/2006" xmlns:aink="http://schemas.microsoft.com/office/drawing/2016/ink" xmlns:am3d="http://schemas.microsoft.com/office/drawing/2017/model3d" xmlns:o="urn:schemas-microsoft-com:office:office" xmlns:r="http://schemas.openxmlformats.org/officeDocument/2006/relationships" xmlns:m="http://schemas.openxmlformats.org/officeDocument/2006/math" xmlns:v="urn:schemas-microsoft-com:vml" xmlns:wp14="http://schemas.microsoft.com/office/word/2010/wordprocessingDrawing" xmlns:wp="http://schemas.openxmlformats.org/drawingml/2006/wordprocessingDrawing" xmlns:w10="urn:schemas-microsoft-com:office:word" xmlns:w="http://schemas.openxmlformats.org/wordprocessingml/2006/main" xmlns:w14="http://schemas.microsoft.com/office/word/2010/wordml" xmlns:w15="http://schemas.microsoft.com/office/word/2012/wordml" xmlns:w16cex="http://schemas.microsoft.com/office/word/2018/wordml/cex" xmlns:w16cid="http://schemas.microsoft.com/office/word/2016/wordml/cid" xmlns:w16="http://schemas.microsoft.com/office/word/2018/wordml" xmlns:w16sdtdh="http://schemas.microsoft.com/office/word/2020/wordml/sdtdatahash" xmlns:w16se="http://schemas.microsoft.com/office/word/2015/wordml/symex" xmlns:wpg="http://schemas.microsoft.com/office/word/2010/wordprocessingGroup" xmlns:wpi="http://schemas.microsoft.com/office/word/2010/wordprocessingInk" xmlns:wne="http://schemas.microsoft.com/office/word/2006/wordml" xmlns:wps="http://schemas.microsoft.com/office/word/2010/wordprocessingShape" mc:Ignorable="w14 w15 w16se w16cid w16 w16cex w16sdtdh wp14">
-  <w:abstractNum w:abstractNumId="0" w15:restartNumberingAfterBreak="0">
+<w:numbering xmlns:wpc="http://schemas.microsoft.com/office/word/2010/wordprocessingCanvas" xmlns:mc="http://schemas.openxmlformats.org/markup-compatibility/2006" xmlns:o="urn:schemas-microsoft-com:office:office" xmlns:r="http://schemas.openxmlformats.org/officeDocument/2006/relationships" xmlns:m="http://schemas.openxmlformats.org/officeDocument/2006/math" xmlns:v="urn:schemas-microsoft-com:vml" xmlns:wp14="http://schemas.microsoft.com/office/word/2010/wordprocessingDrawing" xmlns:wp="http://schemas.openxmlformats.org/drawingml/2006/wordprocessingDrawing" xmlns:w10="urn:schemas-microsoft-com:office:word" xmlns:w="http://schemas.openxmlformats.org/wordprocessingml/2006/main" xmlns:w14="http://schemas.microsoft.com/office/word/2010/wordml" xmlns:wpg="http://schemas.microsoft.com/office/word/2010/wordprocessingGroup" xmlns:wpi="http://schemas.microsoft.com/office/word/2010/wordprocessingInk" xmlns:wne="http://schemas.microsoft.com/office/word/2006/wordml" xmlns:wps="http://schemas.microsoft.com/office/word/2010/wordprocessingShape" mc:Ignorable="w14 wp14">
+  <w:abstractNum w:abstractNumId="0">
     <w:nsid w:val="02066222"/>
     <w:multiLevelType w:val="hybridMultilevel"/>
     <w:tmpl w:val="73A4BAE4"/>
@@ -23970,7 +24142,7 @@
       </w:pPr>
     </w:lvl>
   </w:abstractNum>
-  <w:abstractNum w:abstractNumId="1" w15:restartNumberingAfterBreak="0">
+  <w:abstractNum w:abstractNumId="1">
     <w:nsid w:val="0CA7072D"/>
     <w:multiLevelType w:val="multilevel"/>
     <w:tmpl w:val="E84E96B2"/>
@@ -24083,7 +24255,7 @@
       </w:pPr>
     </w:lvl>
   </w:abstractNum>
-  <w:abstractNum w:abstractNumId="2" w15:restartNumberingAfterBreak="0">
+  <w:abstractNum w:abstractNumId="2">
     <w:nsid w:val="0FBD0622"/>
     <w:multiLevelType w:val="multilevel"/>
     <w:tmpl w:val="E84E96B2"/>
@@ -24196,7 +24368,7 @@
       </w:pPr>
     </w:lvl>
   </w:abstractNum>
-  <w:abstractNum w:abstractNumId="3" w15:restartNumberingAfterBreak="0">
+  <w:abstractNum w:abstractNumId="3">
     <w:nsid w:val="2E5C2C36"/>
     <w:multiLevelType w:val="multilevel"/>
     <w:tmpl w:val="667AB24A"/>
@@ -24309,7 +24481,7 @@
       </w:pPr>
     </w:lvl>
   </w:abstractNum>
-  <w:abstractNum w:abstractNumId="4" w15:restartNumberingAfterBreak="0">
+  <w:abstractNum w:abstractNumId="4">
     <w:nsid w:val="345B45C4"/>
     <w:multiLevelType w:val="multilevel"/>
     <w:tmpl w:val="74CAF460"/>
@@ -24458,7 +24630,7 @@
       </w:rPr>
     </w:lvl>
   </w:abstractNum>
-  <w:abstractNum w:abstractNumId="5" w15:restartNumberingAfterBreak="0">
+  <w:abstractNum w:abstractNumId="5">
     <w:nsid w:val="3AA21365"/>
     <w:multiLevelType w:val="multilevel"/>
     <w:tmpl w:val="E84E96B2"/>
@@ -24571,7 +24743,7 @@
       </w:pPr>
     </w:lvl>
   </w:abstractNum>
-  <w:abstractNum w:abstractNumId="6" w15:restartNumberingAfterBreak="0">
+  <w:abstractNum w:abstractNumId="6">
     <w:nsid w:val="3AFD2F74"/>
     <w:multiLevelType w:val="multilevel"/>
     <w:tmpl w:val="54440DB8"/>
@@ -24720,7 +24892,7 @@
       </w:rPr>
     </w:lvl>
   </w:abstractNum>
-  <w:abstractNum w:abstractNumId="7" w15:restartNumberingAfterBreak="0">
+  <w:abstractNum w:abstractNumId="7">
     <w:nsid w:val="426844BF"/>
     <w:multiLevelType w:val="hybridMultilevel"/>
     <w:tmpl w:val="82D82960"/>
@@ -24833,7 +25005,7 @@
       </w:rPr>
     </w:lvl>
   </w:abstractNum>
-  <w:abstractNum w:abstractNumId="8" w15:restartNumberingAfterBreak="0">
+  <w:abstractNum w:abstractNumId="8">
     <w:nsid w:val="49226DF0"/>
     <w:multiLevelType w:val="multilevel"/>
     <w:tmpl w:val="B9129A9C"/>
@@ -24982,7 +25154,7 @@
       </w:rPr>
     </w:lvl>
   </w:abstractNum>
-  <w:abstractNum w:abstractNumId="9" w15:restartNumberingAfterBreak="0">
+  <w:abstractNum w:abstractNumId="9">
     <w:nsid w:val="49964183"/>
     <w:multiLevelType w:val="multilevel"/>
     <w:tmpl w:val="D2C2E6AA"/>
@@ -25099,7 +25271,7 @@
       </w:pPr>
     </w:lvl>
   </w:abstractNum>
-  <w:abstractNum w:abstractNumId="10" w15:restartNumberingAfterBreak="0">
+  <w:abstractNum w:abstractNumId="10">
     <w:nsid w:val="4C5F220E"/>
     <w:multiLevelType w:val="multilevel"/>
     <w:tmpl w:val="476A2484"/>
@@ -25248,7 +25420,7 @@
       </w:rPr>
     </w:lvl>
   </w:abstractNum>
-  <w:abstractNum w:abstractNumId="11" w15:restartNumberingAfterBreak="0">
+  <w:abstractNum w:abstractNumId="11">
     <w:nsid w:val="53506720"/>
     <w:multiLevelType w:val="hybridMultilevel"/>
     <w:tmpl w:val="3BB01F22"/>
@@ -25337,7 +25509,7 @@
       </w:pPr>
     </w:lvl>
   </w:abstractNum>
-  <w:abstractNum w:abstractNumId="12" w15:restartNumberingAfterBreak="0">
+  <w:abstractNum w:abstractNumId="12">
     <w:nsid w:val="55CE7551"/>
     <w:multiLevelType w:val="multilevel"/>
     <w:tmpl w:val="DC565FB2"/>
@@ -25486,7 +25658,7 @@
       </w:rPr>
     </w:lvl>
   </w:abstractNum>
-  <w:abstractNum w:abstractNumId="13" w15:restartNumberingAfterBreak="0">
+  <w:abstractNum w:abstractNumId="13">
     <w:nsid w:val="5C753187"/>
     <w:multiLevelType w:val="multilevel"/>
     <w:tmpl w:val="E84E96B2"/>
@@ -25599,7 +25771,7 @@
       </w:pPr>
     </w:lvl>
   </w:abstractNum>
-  <w:abstractNum w:abstractNumId="14" w15:restartNumberingAfterBreak="0">
+  <w:abstractNum w:abstractNumId="14">
     <w:nsid w:val="5E03659D"/>
     <w:multiLevelType w:val="multilevel"/>
     <w:tmpl w:val="E84E96B2"/>
@@ -25712,7 +25884,7 @@
       </w:pPr>
     </w:lvl>
   </w:abstractNum>
-  <w:abstractNum w:abstractNumId="15" w15:restartNumberingAfterBreak="0">
+  <w:abstractNum w:abstractNumId="15">
     <w:nsid w:val="631A2714"/>
     <w:multiLevelType w:val="multilevel"/>
     <w:tmpl w:val="AA2CEA8E"/>
@@ -25861,7 +26033,7 @@
       </w:rPr>
     </w:lvl>
   </w:abstractNum>
-  <w:abstractNum w:abstractNumId="16" w15:restartNumberingAfterBreak="0">
+  <w:abstractNum w:abstractNumId="16">
     <w:nsid w:val="6D2A3EA6"/>
     <w:multiLevelType w:val="multilevel"/>
     <w:tmpl w:val="3136751C"/>
@@ -26065,7 +26237,7 @@
 </file>
 
 <file path=word/styles.xml><?xml version="1.0" encoding="utf-8"?>
-<w:styles xmlns:mc="http://schemas.openxmlformats.org/markup-compatibility/2006" xmlns:r="http://schemas.openxmlformats.org/officeDocument/2006/relationships" xmlns:w="http://schemas.openxmlformats.org/wordprocessingml/2006/main" xmlns:w14="http://schemas.microsoft.com/office/word/2010/wordml" xmlns:w15="http://schemas.microsoft.com/office/word/2012/wordml" xmlns:w16cex="http://schemas.microsoft.com/office/word/2018/wordml/cex" xmlns:w16cid="http://schemas.microsoft.com/office/word/2016/wordml/cid" xmlns:w16="http://schemas.microsoft.com/office/word/2018/wordml" xmlns:w16sdtdh="http://schemas.microsoft.com/office/word/2020/wordml/sdtdatahash" xmlns:w16se="http://schemas.microsoft.com/office/word/2015/wordml/symex" mc:Ignorable="w14 w15 w16se w16cid w16 w16cex w16sdtdh">
+<w:styles xmlns:mc="http://schemas.openxmlformats.org/markup-compatibility/2006" xmlns:r="http://schemas.openxmlformats.org/officeDocument/2006/relationships" xmlns:w="http://schemas.openxmlformats.org/wordprocessingml/2006/main" xmlns:w14="http://schemas.microsoft.com/office/word/2010/wordml" mc:Ignorable="w14">
   <w:docDefaults>
     <w:rPrDefault>
       <w:rPr>
@@ -26083,383 +26255,145 @@
       </w:pPr>
     </w:pPrDefault>
   </w:docDefaults>
-  <w:latentStyles w:defLockedState="0" w:defUIPriority="99" w:defSemiHidden="0" w:defUnhideWhenUsed="0" w:defQFormat="0" w:count="376">
-    <w:lsdException w:name="Normal" w:uiPriority="0" w:qFormat="1"/>
-    <w:lsdException w:name="heading 1" w:uiPriority="9" w:qFormat="1"/>
-    <w:lsdException w:name="heading 2" w:semiHidden="1" w:uiPriority="9" w:unhideWhenUsed="1" w:qFormat="1"/>
-    <w:lsdException w:name="heading 3" w:semiHidden="1" w:uiPriority="9" w:unhideWhenUsed="1" w:qFormat="1"/>
-    <w:lsdException w:name="heading 4" w:semiHidden="1" w:uiPriority="9" w:unhideWhenUsed="1" w:qFormat="1"/>
-    <w:lsdException w:name="heading 5" w:semiHidden="1" w:uiPriority="9" w:unhideWhenUsed="1" w:qFormat="1"/>
-    <w:lsdException w:name="heading 6" w:semiHidden="1" w:uiPriority="9" w:unhideWhenUsed="1" w:qFormat="1"/>
-    <w:lsdException w:name="heading 7" w:semiHidden="1" w:uiPriority="9" w:unhideWhenUsed="1" w:qFormat="1"/>
-    <w:lsdException w:name="heading 8" w:semiHidden="1" w:uiPriority="9" w:unhideWhenUsed="1" w:qFormat="1"/>
-    <w:lsdException w:name="heading 9" w:semiHidden="1" w:uiPriority="9" w:unhideWhenUsed="1" w:qFormat="1"/>
-    <w:lsdException w:name="index 1" w:semiHidden="1" w:unhideWhenUsed="1"/>
-    <w:lsdException w:name="index 2" w:semiHidden="1" w:unhideWhenUsed="1"/>
-    <w:lsdException w:name="index 3" w:semiHidden="1" w:unhideWhenUsed="1"/>
-    <w:lsdException w:name="index 4" w:semiHidden="1" w:unhideWhenUsed="1"/>
-    <w:lsdException w:name="index 5" w:semiHidden="1" w:unhideWhenUsed="1"/>
-    <w:lsdException w:name="index 6" w:semiHidden="1" w:unhideWhenUsed="1"/>
-    <w:lsdException w:name="index 7" w:semiHidden="1" w:unhideWhenUsed="1"/>
-    <w:lsdException w:name="index 8" w:semiHidden="1" w:unhideWhenUsed="1"/>
-    <w:lsdException w:name="index 9" w:semiHidden="1" w:unhideWhenUsed="1"/>
-    <w:lsdException w:name="toc 1" w:semiHidden="1" w:uiPriority="39" w:unhideWhenUsed="1"/>
-    <w:lsdException w:name="toc 2" w:semiHidden="1" w:uiPriority="39" w:unhideWhenUsed="1"/>
-    <w:lsdException w:name="toc 3" w:semiHidden="1" w:uiPriority="39" w:unhideWhenUsed="1"/>
-    <w:lsdException w:name="toc 4" w:semiHidden="1" w:uiPriority="39" w:unhideWhenUsed="1"/>
-    <w:lsdException w:name="toc 5" w:semiHidden="1" w:uiPriority="39" w:unhideWhenUsed="1"/>
-    <w:lsdException w:name="toc 6" w:semiHidden="1" w:uiPriority="39" w:unhideWhenUsed="1"/>
-    <w:lsdException w:name="toc 7" w:semiHidden="1" w:uiPriority="39" w:unhideWhenUsed="1"/>
-    <w:lsdException w:name="toc 8" w:semiHidden="1" w:uiPriority="39" w:unhideWhenUsed="1"/>
-    <w:lsdException w:name="toc 9" w:semiHidden="1" w:uiPriority="39" w:unhideWhenUsed="1"/>
-    <w:lsdException w:name="Normal Indent" w:semiHidden="1" w:unhideWhenUsed="1"/>
-    <w:lsdException w:name="footnote text" w:semiHidden="1" w:unhideWhenUsed="1"/>
-    <w:lsdException w:name="annotation text" w:semiHidden="1" w:unhideWhenUsed="1"/>
-    <w:lsdException w:name="header" w:semiHidden="1" w:unhideWhenUsed="1"/>
-    <w:lsdException w:name="footer" w:semiHidden="1" w:unhideWhenUsed="1"/>
-    <w:lsdException w:name="index heading" w:semiHidden="1" w:unhideWhenUsed="1"/>
-    <w:lsdException w:name="caption" w:semiHidden="1" w:uiPriority="35" w:unhideWhenUsed="1" w:qFormat="1"/>
-    <w:lsdException w:name="table of figures" w:semiHidden="1" w:unhideWhenUsed="1"/>
-    <w:lsdException w:name="envelope address" w:semiHidden="1" w:unhideWhenUsed="1"/>
-    <w:lsdException w:name="envelope return" w:semiHidden="1" w:unhideWhenUsed="1"/>
-    <w:lsdException w:name="footnote reference" w:semiHidden="1" w:unhideWhenUsed="1"/>
-    <w:lsdException w:name="annotation reference" w:semiHidden="1" w:unhideWhenUsed="1"/>
-    <w:lsdException w:name="line number" w:semiHidden="1" w:unhideWhenUsed="1"/>
-    <w:lsdException w:name="page number" w:semiHidden="1" w:unhideWhenUsed="1"/>
-    <w:lsdException w:name="endnote reference" w:semiHidden="1" w:unhideWhenUsed="1"/>
-    <w:lsdException w:name="endnote text" w:semiHidden="1" w:unhideWhenUsed="1"/>
-    <w:lsdException w:name="table of authorities" w:semiHidden="1" w:unhideWhenUsed="1"/>
-    <w:lsdException w:name="macro" w:semiHidden="1" w:unhideWhenUsed="1"/>
-    <w:lsdException w:name="toa heading" w:semiHidden="1" w:unhideWhenUsed="1"/>
-    <w:lsdException w:name="List" w:semiHidden="1" w:unhideWhenUsed="1"/>
-    <w:lsdException w:name="List Bullet" w:semiHidden="1" w:unhideWhenUsed="1"/>
-    <w:lsdException w:name="List Number" w:semiHidden="1" w:unhideWhenUsed="1"/>
-    <w:lsdException w:name="List 2" w:semiHidden="1" w:unhideWhenUsed="1"/>
-    <w:lsdException w:name="List 3" w:semiHidden="1" w:unhideWhenUsed="1"/>
-    <w:lsdException w:name="List 4" w:semiHidden="1" w:unhideWhenUsed="1"/>
-    <w:lsdException w:name="List 5" w:semiHidden="1" w:unhideWhenUsed="1"/>
-    <w:lsdException w:name="List Bullet 2" w:semiHidden="1" w:unhideWhenUsed="1"/>
-    <w:lsdException w:name="List Bullet 3" w:semiHidden="1" w:unhideWhenUsed="1"/>
-    <w:lsdException w:name="List Bullet 4" w:semiHidden="1" w:unhideWhenUsed="1"/>
-    <w:lsdException w:name="List Bullet 5" w:semiHidden="1" w:unhideWhenUsed="1"/>
-    <w:lsdException w:name="List Number 2" w:semiHidden="1" w:unhideWhenUsed="1"/>
-    <w:lsdException w:name="List Number 3" w:semiHidden="1" w:unhideWhenUsed="1"/>
-    <w:lsdException w:name="List Number 4" w:semiHidden="1" w:unhideWhenUsed="1"/>
-    <w:lsdException w:name="List Number 5" w:semiHidden="1" w:unhideWhenUsed="1"/>
-    <w:lsdException w:name="Title" w:uiPriority="10" w:qFormat="1"/>
-    <w:lsdException w:name="Closing" w:semiHidden="1" w:unhideWhenUsed="1"/>
-    <w:lsdException w:name="Signature" w:semiHidden="1" w:unhideWhenUsed="1"/>
-    <w:lsdException w:name="Default Paragraph Font" w:semiHidden="1" w:uiPriority="1" w:unhideWhenUsed="1"/>
-    <w:lsdException w:name="Body Text" w:semiHidden="1" w:uiPriority="1" w:unhideWhenUsed="1" w:qFormat="1"/>
-    <w:lsdException w:name="Body Text Indent" w:semiHidden="1" w:unhideWhenUsed="1"/>
-    <w:lsdException w:name="List Continue" w:semiHidden="1" w:unhideWhenUsed="1"/>
-    <w:lsdException w:name="List Continue 2" w:semiHidden="1" w:unhideWhenUsed="1"/>
-    <w:lsdException w:name="List Continue 3" w:semiHidden="1" w:unhideWhenUsed="1"/>
-    <w:lsdException w:name="List Continue 4" w:semiHidden="1" w:unhideWhenUsed="1"/>
-    <w:lsdException w:name="List Continue 5" w:semiHidden="1" w:unhideWhenUsed="1"/>
-    <w:lsdException w:name="Message Header" w:semiHidden="1" w:unhideWhenUsed="1"/>
-    <w:lsdException w:name="Subtitle" w:uiPriority="11" w:qFormat="1"/>
-    <w:lsdException w:name="Salutation" w:semiHidden="1" w:unhideWhenUsed="1"/>
-    <w:lsdException w:name="Date" w:semiHidden="1" w:unhideWhenUsed="1"/>
-    <w:lsdException w:name="Body Text First Indent" w:semiHidden="1" w:unhideWhenUsed="1"/>
-    <w:lsdException w:name="Body Text First Indent 2" w:semiHidden="1" w:unhideWhenUsed="1"/>
-    <w:lsdException w:name="Note Heading" w:semiHidden="1" w:unhideWhenUsed="1"/>
-    <w:lsdException w:name="Body Text 2" w:semiHidden="1" w:unhideWhenUsed="1"/>
-    <w:lsdException w:name="Body Text 3" w:semiHidden="1" w:unhideWhenUsed="1"/>
-    <w:lsdException w:name="Body Text Indent 2" w:semiHidden="1" w:unhideWhenUsed="1"/>
-    <w:lsdException w:name="Body Text Indent 3" w:semiHidden="1" w:unhideWhenUsed="1"/>
-    <w:lsdException w:name="Block Text" w:semiHidden="1" w:unhideWhenUsed="1"/>
-    <w:lsdException w:name="Hyperlink" w:semiHidden="1" w:unhideWhenUsed="1"/>
-    <w:lsdException w:name="FollowedHyperlink" w:semiHidden="1" w:unhideWhenUsed="1"/>
-    <w:lsdException w:name="Strong" w:uiPriority="22" w:qFormat="1"/>
-    <w:lsdException w:name="Emphasis" w:uiPriority="20" w:qFormat="1"/>
-    <w:lsdException w:name="Document Map" w:semiHidden="1" w:unhideWhenUsed="1"/>
-    <w:lsdException w:name="Plain Text" w:semiHidden="1" w:unhideWhenUsed="1"/>
-    <w:lsdException w:name="E-mail Signature" w:semiHidden="1" w:unhideWhenUsed="1"/>
-    <w:lsdException w:name="HTML Top of Form" w:semiHidden="1" w:unhideWhenUsed="1"/>
-    <w:lsdException w:name="HTML Bottom of Form" w:semiHidden="1" w:unhideWhenUsed="1"/>
-    <w:lsdException w:name="Normal (Web)" w:semiHidden="1" w:unhideWhenUsed="1"/>
-    <w:lsdException w:name="HTML Acronym" w:semiHidden="1" w:unhideWhenUsed="1"/>
-    <w:lsdException w:name="HTML Address" w:semiHidden="1" w:unhideWhenUsed="1"/>
-    <w:lsdException w:name="HTML Cite" w:semiHidden="1" w:unhideWhenUsed="1"/>
-    <w:lsdException w:name="HTML Code" w:semiHidden="1" w:unhideWhenUsed="1"/>
-    <w:lsdException w:name="HTML Definition" w:semiHidden="1" w:unhideWhenUsed="1"/>
-    <w:lsdException w:name="HTML Keyboard" w:semiHidden="1" w:unhideWhenUsed="1"/>
-    <w:lsdException w:name="HTML Preformatted" w:semiHidden="1" w:unhideWhenUsed="1"/>
-    <w:lsdException w:name="HTML Sample" w:semiHidden="1" w:unhideWhenUsed="1"/>
-    <w:lsdException w:name="HTML Typewriter" w:semiHidden="1" w:unhideWhenUsed="1"/>
-    <w:lsdException w:name="HTML Variable" w:semiHidden="1" w:unhideWhenUsed="1"/>
-    <w:lsdException w:name="Normal Table" w:semiHidden="1" w:unhideWhenUsed="1"/>
-    <w:lsdException w:name="annotation subject" w:semiHidden="1" w:unhideWhenUsed="1"/>
-    <w:lsdException w:name="No List" w:semiHidden="1" w:unhideWhenUsed="1"/>
-    <w:lsdException w:name="Outline List 1" w:semiHidden="1" w:unhideWhenUsed="1"/>
-    <w:lsdException w:name="Outline List 2" w:semiHidden="1" w:unhideWhenUsed="1"/>
-    <w:lsdException w:name="Outline List 3" w:semiHidden="1" w:unhideWhenUsed="1"/>
-    <w:lsdException w:name="Table Simple 1" w:semiHidden="1" w:unhideWhenUsed="1"/>
-    <w:lsdException w:name="Table Simple 2" w:semiHidden="1" w:unhideWhenUsed="1"/>
-    <w:lsdException w:name="Table Simple 3" w:semiHidden="1" w:unhideWhenUsed="1"/>
-    <w:lsdException w:name="Table Classic 1" w:semiHidden="1" w:unhideWhenUsed="1"/>
-    <w:lsdException w:name="Table Classic 2" w:semiHidden="1" w:unhideWhenUsed="1"/>
-    <w:lsdException w:name="Table Classic 3" w:semiHidden="1" w:unhideWhenUsed="1"/>
-    <w:lsdException w:name="Table Classic 4" w:semiHidden="1" w:unhideWhenUsed="1"/>
-    <w:lsdException w:name="Table Colorful 1" w:semiHidden="1" w:unhideWhenUsed="1"/>
-    <w:lsdException w:name="Table Colorful 2" w:semiHidden="1" w:unhideWhenUsed="1"/>
-    <w:lsdException w:name="Table Colorful 3" w:semiHidden="1" w:unhideWhenUsed="1"/>
-    <w:lsdException w:name="Table Columns 1" w:semiHidden="1" w:unhideWhenUsed="1"/>
-    <w:lsdException w:name="Table Columns 2" w:semiHidden="1" w:unhideWhenUsed="1"/>
-    <w:lsdException w:name="Table Columns 3" w:semiHidden="1" w:unhideWhenUsed="1"/>
-    <w:lsdException w:name="Table Columns 4" w:semiHidden="1" w:unhideWhenUsed="1"/>
-    <w:lsdException w:name="Table Columns 5" w:semiHidden="1" w:unhideWhenUsed="1"/>
-    <w:lsdException w:name="Table Grid 1" w:semiHidden="1" w:unhideWhenUsed="1"/>
-    <w:lsdException w:name="Table Grid 2" w:semiHidden="1" w:unhideWhenUsed="1"/>
-    <w:lsdException w:name="Table Grid 3" w:semiHidden="1" w:unhideWhenUsed="1"/>
-    <w:lsdException w:name="Table Grid 4" w:semiHidden="1" w:unhideWhenUsed="1"/>
-    <w:lsdException w:name="Table Grid 5" w:semiHidden="1" w:unhideWhenUsed="1"/>
-    <w:lsdException w:name="Table Grid 6" w:semiHidden="1" w:unhideWhenUsed="1"/>
-    <w:lsdException w:name="Table Grid 7" w:semiHidden="1" w:unhideWhenUsed="1"/>
-    <w:lsdException w:name="Table Grid 8" w:semiHidden="1" w:unhideWhenUsed="1"/>
-    <w:lsdException w:name="Table List 1" w:semiHidden="1" w:unhideWhenUsed="1"/>
-    <w:lsdException w:name="Table List 2" w:semiHidden="1" w:unhideWhenUsed="1"/>
-    <w:lsdException w:name="Table List 3" w:semiHidden="1" w:unhideWhenUsed="1"/>
-    <w:lsdException w:name="Table List 4" w:semiHidden="1" w:unhideWhenUsed="1"/>
-    <w:lsdException w:name="Table List 5" w:semiHidden="1" w:unhideWhenUsed="1"/>
-    <w:lsdException w:name="Table List 6" w:semiHidden="1" w:unhideWhenUsed="1"/>
-    <w:lsdException w:name="Table List 7" w:semiHidden="1" w:unhideWhenUsed="1"/>
-    <w:lsdException w:name="Table List 8" w:semiHidden="1" w:unhideWhenUsed="1"/>
-    <w:lsdException w:name="Table 3D effects 1" w:semiHidden="1" w:unhideWhenUsed="1"/>
-    <w:lsdException w:name="Table 3D effects 2" w:semiHidden="1" w:unhideWhenUsed="1"/>
-    <w:lsdException w:name="Table 3D effects 3" w:semiHidden="1" w:unhideWhenUsed="1"/>
-    <w:lsdException w:name="Table Contemporary" w:semiHidden="1" w:unhideWhenUsed="1"/>
-    <w:lsdException w:name="Table Elegant" w:semiHidden="1" w:unhideWhenUsed="1"/>
-    <w:lsdException w:name="Table Professional" w:semiHidden="1" w:unhideWhenUsed="1"/>
-    <w:lsdException w:name="Table Subtle 1" w:semiHidden="1" w:unhideWhenUsed="1"/>
-    <w:lsdException w:name="Table Subtle 2" w:semiHidden="1" w:unhideWhenUsed="1"/>
-    <w:lsdException w:name="Table Web 1" w:semiHidden="1" w:unhideWhenUsed="1"/>
-    <w:lsdException w:name="Table Web 2" w:semiHidden="1" w:unhideWhenUsed="1"/>
-    <w:lsdException w:name="Table Web 3" w:semiHidden="1" w:unhideWhenUsed="1"/>
-    <w:lsdException w:name="Balloon Text" w:semiHidden="1" w:unhideWhenUsed="1"/>
-    <w:lsdException w:name="Table Grid" w:uiPriority="39"/>
-    <w:lsdException w:name="Table Theme" w:semiHidden="1" w:unhideWhenUsed="1"/>
-    <w:lsdException w:name="Placeholder Text" w:semiHidden="1"/>
-    <w:lsdException w:name="No Spacing" w:uiPriority="1" w:qFormat="1"/>
-    <w:lsdException w:name="Light Shading" w:uiPriority="60"/>
-    <w:lsdException w:name="Light List" w:uiPriority="61"/>
-    <w:lsdException w:name="Light Grid" w:uiPriority="62"/>
-    <w:lsdException w:name="Medium Shading 1" w:uiPriority="63"/>
-    <w:lsdException w:name="Medium Shading 2" w:uiPriority="64"/>
-    <w:lsdException w:name="Medium List 1" w:uiPriority="65"/>
-    <w:lsdException w:name="Medium List 2" w:uiPriority="66"/>
-    <w:lsdException w:name="Medium Grid 1" w:uiPriority="67"/>
-    <w:lsdException w:name="Medium Grid 2" w:uiPriority="68"/>
-    <w:lsdException w:name="Medium Grid 3" w:uiPriority="69"/>
-    <w:lsdException w:name="Dark List" w:uiPriority="70"/>
-    <w:lsdException w:name="Colorful Shading" w:uiPriority="71"/>
-    <w:lsdException w:name="Colorful List" w:uiPriority="72"/>
-    <w:lsdException w:name="Colorful Grid" w:uiPriority="73"/>
-    <w:lsdException w:name="Light Shading Accent 1" w:uiPriority="60"/>
-    <w:lsdException w:name="Light List Accent 1" w:uiPriority="61"/>
-    <w:lsdException w:name="Light Grid Accent 1" w:uiPriority="62"/>
-    <w:lsdException w:name="Medium Shading 1 Accent 1" w:uiPriority="63"/>
-    <w:lsdException w:name="Medium Shading 2 Accent 1" w:uiPriority="64"/>
-    <w:lsdException w:name="Medium List 1 Accent 1" w:uiPriority="65"/>
-    <w:lsdException w:name="Revision" w:semiHidden="1"/>
-    <w:lsdException w:name="List Paragraph" w:uiPriority="34" w:qFormat="1"/>
-    <w:lsdException w:name="Quote" w:uiPriority="29" w:qFormat="1"/>
-    <w:lsdException w:name="Intense Quote" w:uiPriority="30" w:qFormat="1"/>
-    <w:lsdException w:name="Medium List 2 Accent 1" w:uiPriority="66"/>
-    <w:lsdException w:name="Medium Grid 1 Accent 1" w:uiPriority="67"/>
-    <w:lsdException w:name="Medium Grid 2 Accent 1" w:uiPriority="68"/>
-    <w:lsdException w:name="Medium Grid 3 Accent 1" w:uiPriority="69"/>
-    <w:lsdException w:name="Dark List Accent 1" w:uiPriority="70"/>
-    <w:lsdException w:name="Colorful Shading Accent 1" w:uiPriority="71"/>
-    <w:lsdException w:name="Colorful List Accent 1" w:uiPriority="72"/>
-    <w:lsdException w:name="Colorful Grid Accent 1" w:uiPriority="73"/>
-    <w:lsdException w:name="Light Shading Accent 2" w:uiPriority="60"/>
-    <w:lsdException w:name="Light List Accent 2" w:uiPriority="61"/>
-    <w:lsdException w:name="Light Grid Accent 2" w:uiPriority="62"/>
-    <w:lsdException w:name="Medium Shading 1 Accent 2" w:uiPriority="63"/>
-    <w:lsdException w:name="Medium Shading 2 Accent 2" w:uiPriority="64"/>
-    <w:lsdException w:name="Medium List 1 Accent 2" w:uiPriority="65"/>
-    <w:lsdException w:name="Medium List 2 Accent 2" w:uiPriority="66"/>
-    <w:lsdException w:name="Medium Grid 1 Accent 2" w:uiPriority="67"/>
-    <w:lsdException w:name="Medium Grid 2 Accent 2" w:uiPriority="68"/>
-    <w:lsdException w:name="Medium Grid 3 Accent 2" w:uiPriority="69"/>
-    <w:lsdException w:name="Dark List Accent 2" w:uiPriority="70"/>
-    <w:lsdException w:name="Colorful Shading Accent 2" w:uiPriority="71"/>
-    <w:lsdException w:name="Colorful List Accent 2" w:uiPriority="72"/>
-    <w:lsdException w:name="Colorful Grid Accent 2" w:uiPriority="73"/>
-    <w:lsdException w:name="Light Shading Accent 3" w:uiPriority="60"/>
-    <w:lsdException w:name="Light List Accent 3" w:uiPriority="61"/>
-    <w:lsdException w:name="Light Grid Accent 3" w:uiPriority="62"/>
-    <w:lsdException w:name="Medium Shading 1 Accent 3" w:uiPriority="63"/>
-    <w:lsdException w:name="Medium Shading 2 Accent 3" w:uiPriority="64"/>
-    <w:lsdException w:name="Medium List 1 Accent 3" w:uiPriority="65"/>
-    <w:lsdException w:name="Medium List 2 Accent 3" w:uiPriority="66"/>
-    <w:lsdException w:name="Medium Grid 1 Accent 3" w:uiPriority="67"/>
-    <w:lsdException w:name="Medium Grid 2 Accent 3" w:uiPriority="68"/>
-    <w:lsdException w:name="Medium Grid 3 Accent 3" w:uiPriority="69"/>
-    <w:lsdException w:name="Dark List Accent 3" w:uiPriority="70"/>
-    <w:lsdException w:name="Colorful Shading Accent 3" w:uiPriority="71"/>
-    <w:lsdException w:name="Colorful List Accent 3" w:uiPriority="72"/>
-    <w:lsdException w:name="Colorful Grid Accent 3" w:uiPriority="73"/>
-    <w:lsdException w:name="Light Shading Accent 4" w:uiPriority="60"/>
-    <w:lsdException w:name="Light List Accent 4" w:uiPriority="61"/>
-    <w:lsdException w:name="Light Grid Accent 4" w:uiPriority="62"/>
-    <w:lsdException w:name="Medium Shading 1 Accent 4" w:uiPriority="63"/>
-    <w:lsdException w:name="Medium Shading 2 Accent 4" w:uiPriority="64"/>
-    <w:lsdException w:name="Medium List 1 Accent 4" w:uiPriority="65"/>
-    <w:lsdException w:name="Medium List 2 Accent 4" w:uiPriority="66"/>
-    <w:lsdException w:name="Medium Grid 1 Accent 4" w:uiPriority="67"/>
-    <w:lsdException w:name="Medium Grid 2 Accent 4" w:uiPriority="68"/>
-    <w:lsdException w:name="Medium Grid 3 Accent 4" w:uiPriority="69"/>
-    <w:lsdException w:name="Dark List Accent 4" w:uiPriority="70"/>
-    <w:lsdException w:name="Colorful Shading Accent 4" w:uiPriority="71"/>
-    <w:lsdException w:name="Colorful List Accent 4" w:uiPriority="72"/>
-    <w:lsdException w:name="Colorful Grid Accent 4" w:uiPriority="73"/>
-    <w:lsdException w:name="Light Shading Accent 5" w:uiPriority="60"/>
-    <w:lsdException w:name="Light List Accent 5" w:uiPriority="61"/>
-    <w:lsdException w:name="Light Grid Accent 5" w:uiPriority="62"/>
-    <w:lsdException w:name="Medium Shading 1 Accent 5" w:uiPriority="63"/>
-    <w:lsdException w:name="Medium Shading 2 Accent 5" w:uiPriority="64"/>
-    <w:lsdException w:name="Medium List 1 Accent 5" w:uiPriority="65"/>
-    <w:lsdException w:name="Medium List 2 Accent 5" w:uiPriority="66"/>
-    <w:lsdException w:name="Medium Grid 1 Accent 5" w:uiPriority="67"/>
-    <w:lsdException w:name="Medium Grid 2 Accent 5" w:uiPriority="68"/>
-    <w:lsdException w:name="Medium Grid 3 Accent 5" w:uiPriority="69"/>
-    <w:lsdException w:name="Dark List Accent 5" w:uiPriority="70"/>
-    <w:lsdException w:name="Colorful Shading Accent 5" w:uiPriority="71"/>
-    <w:lsdException w:name="Colorful List Accent 5" w:uiPriority="72"/>
-    <w:lsdException w:name="Colorful Grid Accent 5" w:uiPriority="73"/>
-    <w:lsdException w:name="Light Shading Accent 6" w:uiPriority="60"/>
-    <w:lsdException w:name="Light List Accent 6" w:uiPriority="61"/>
-    <w:lsdException w:name="Light Grid Accent 6" w:uiPriority="62"/>
-    <w:lsdException w:name="Medium Shading 1 Accent 6" w:uiPriority="63"/>
-    <w:lsdException w:name="Medium Shading 2 Accent 6" w:uiPriority="64"/>
-    <w:lsdException w:name="Medium List 1 Accent 6" w:uiPriority="65"/>
-    <w:lsdException w:name="Medium List 2 Accent 6" w:uiPriority="66"/>
-    <w:lsdException w:name="Medium Grid 1 Accent 6" w:uiPriority="67"/>
-    <w:lsdException w:name="Medium Grid 2 Accent 6" w:uiPriority="68"/>
-    <w:lsdException w:name="Medium Grid 3 Accent 6" w:uiPriority="69"/>
-    <w:lsdException w:name="Dark List Accent 6" w:uiPriority="70"/>
-    <w:lsdException w:name="Colorful Shading Accent 6" w:uiPriority="71"/>
-    <w:lsdException w:name="Colorful List Accent 6" w:uiPriority="72"/>
-    <w:lsdException w:name="Colorful Grid Accent 6" w:uiPriority="73"/>
-    <w:lsdException w:name="Subtle Emphasis" w:uiPriority="19" w:qFormat="1"/>
-    <w:lsdException w:name="Intense Emphasis" w:uiPriority="21" w:qFormat="1"/>
-    <w:lsdException w:name="Subtle Reference" w:uiPriority="31" w:qFormat="1"/>
-    <w:lsdException w:name="Intense Reference" w:uiPriority="32" w:qFormat="1"/>
-    <w:lsdException w:name="Book Title" w:uiPriority="33" w:qFormat="1"/>
-    <w:lsdException w:name="Bibliography" w:semiHidden="1" w:uiPriority="37" w:unhideWhenUsed="1"/>
-    <w:lsdException w:name="TOC Heading" w:semiHidden="1" w:uiPriority="39" w:unhideWhenUsed="1" w:qFormat="1"/>
-    <w:lsdException w:name="Plain Table 1" w:uiPriority="41"/>
-    <w:lsdException w:name="Plain Table 2" w:uiPriority="42"/>
-    <w:lsdException w:name="Plain Table 3" w:uiPriority="43"/>
-    <w:lsdException w:name="Plain Table 4" w:uiPriority="44"/>
-    <w:lsdException w:name="Plain Table 5" w:uiPriority="45"/>
-    <w:lsdException w:name="Grid Table Light" w:uiPriority="40"/>
-    <w:lsdException w:name="Grid Table 1 Light" w:uiPriority="46"/>
-    <w:lsdException w:name="Grid Table 2" w:uiPriority="47"/>
-    <w:lsdException w:name="Grid Table 3" w:uiPriority="48"/>
-    <w:lsdException w:name="Grid Table 4" w:uiPriority="49"/>
-    <w:lsdException w:name="Grid Table 5 Dark" w:uiPriority="50"/>
-    <w:lsdException w:name="Grid Table 6 Colorful" w:uiPriority="51"/>
-    <w:lsdException w:name="Grid Table 7 Colorful" w:uiPriority="52"/>
-    <w:lsdException w:name="Grid Table 1 Light Accent 1" w:uiPriority="46"/>
-    <w:lsdException w:name="Grid Table 2 Accent 1" w:uiPriority="47"/>
-    <w:lsdException w:name="Grid Table 3 Accent 1" w:uiPriority="48"/>
-    <w:lsdException w:name="Grid Table 4 Accent 1" w:uiPriority="49"/>
-    <w:lsdException w:name="Grid Table 5 Dark Accent 1" w:uiPriority="50"/>
-    <w:lsdException w:name="Grid Table 6 Colorful Accent 1" w:uiPriority="51"/>
-    <w:lsdException w:name="Grid Table 7 Colorful Accent 1" w:uiPriority="52"/>
-    <w:lsdException w:name="Grid Table 1 Light Accent 2" w:uiPriority="46"/>
-    <w:lsdException w:name="Grid Table 2 Accent 2" w:uiPriority="47"/>
-    <w:lsdException w:name="Grid Table 3 Accent 2" w:uiPriority="48"/>
-    <w:lsdException w:name="Grid Table 4 Accent 2" w:uiPriority="49"/>
-    <w:lsdException w:name="Grid Table 5 Dark Accent 2" w:uiPriority="50"/>
-    <w:lsdException w:name="Grid Table 6 Colorful Accent 2" w:uiPriority="51"/>
-    <w:lsdException w:name="Grid Table 7 Colorful Accent 2" w:uiPriority="52"/>
-    <w:lsdException w:name="Grid Table 1 Light Accent 3" w:uiPriority="46"/>
-    <w:lsdException w:name="Grid Table 2 Accent 3" w:uiPriority="47"/>
-    <w:lsdException w:name="Grid Table 3 Accent 3" w:uiPriority="48"/>
-    <w:lsdException w:name="Grid Table 4 Accent 3" w:uiPriority="49"/>
-    <w:lsdException w:name="Grid Table 5 Dark Accent 3" w:uiPriority="50"/>
-    <w:lsdException w:name="Grid Table 6 Colorful Accent 3" w:uiPriority="51"/>
-    <w:lsdException w:name="Grid Table 7 Colorful Accent 3" w:uiPriority="52"/>
-    <w:lsdException w:name="Grid Table 1 Light Accent 4" w:uiPriority="46"/>
-    <w:lsdException w:name="Grid Table 2 Accent 4" w:uiPriority="47"/>
-    <w:lsdException w:name="Grid Table 3 Accent 4" w:uiPriority="48"/>
-    <w:lsdException w:name="Grid Table 4 Accent 4" w:uiPriority="49"/>
-    <w:lsdException w:name="Grid Table 5 Dark Accent 4" w:uiPriority="50"/>
-    <w:lsdException w:name="Grid Table 6 Colorful Accent 4" w:uiPriority="51"/>
-    <w:lsdException w:name="Grid Table 7 Colorful Accent 4" w:uiPriority="52"/>
-    <w:lsdException w:name="Grid Table 1 Light Accent 5" w:uiPriority="46"/>
-    <w:lsdException w:name="Grid Table 2 Accent 5" w:uiPriority="47"/>
-    <w:lsdException w:name="Grid Table 3 Accent 5" w:uiPriority="48"/>
-    <w:lsdException w:name="Grid Table 4 Accent 5" w:uiPriority="49"/>
-    <w:lsdException w:name="Grid Table 5 Dark Accent 5" w:uiPriority="50"/>
-    <w:lsdException w:name="Grid Table 6 Colorful Accent 5" w:uiPriority="51"/>
-    <w:lsdException w:name="Grid Table 7 Colorful Accent 5" w:uiPriority="52"/>
-    <w:lsdException w:name="Grid Table 1 Light Accent 6" w:uiPriority="46"/>
-    <w:lsdException w:name="Grid Table 2 Accent 6" w:uiPriority="47"/>
-    <w:lsdException w:name="Grid Table 3 Accent 6" w:uiPriority="48"/>
-    <w:lsdException w:name="Grid Table 4 Accent 6" w:uiPriority="49"/>
-    <w:lsdException w:name="Grid Table 5 Dark Accent 6" w:uiPriority="50"/>
-    <w:lsdException w:name="Grid Table 6 Colorful Accent 6" w:uiPriority="51"/>
-    <w:lsdException w:name="Grid Table 7 Colorful Accent 6" w:uiPriority="52"/>
-    <w:lsdException w:name="List Table 1 Light" w:uiPriority="46"/>
-    <w:lsdException w:name="List Table 2" w:uiPriority="47"/>
-    <w:lsdException w:name="List Table 3" w:uiPriority="48"/>
-    <w:lsdException w:name="List Table 4" w:uiPriority="49"/>
-    <w:lsdException w:name="List Table 5 Dark" w:uiPriority="50"/>
-    <w:lsdException w:name="List Table 6 Colorful" w:uiPriority="51"/>
-    <w:lsdException w:name="List Table 7 Colorful" w:uiPriority="52"/>
-    <w:lsdException w:name="List Table 1 Light Accent 1" w:uiPriority="46"/>
-    <w:lsdException w:name="List Table 2 Accent 1" w:uiPriority="47"/>
-    <w:lsdException w:name="List Table 3 Accent 1" w:uiPriority="48"/>
-    <w:lsdException w:name="List Table 4 Accent 1" w:uiPriority="49"/>
-    <w:lsdException w:name="List Table 5 Dark Accent 1" w:uiPriority="50"/>
-    <w:lsdException w:name="List Table 6 Colorful Accent 1" w:uiPriority="51"/>
-    <w:lsdException w:name="List Table 7 Colorful Accent 1" w:uiPriority="52"/>
-    <w:lsdException w:name="List Table 1 Light Accent 2" w:uiPriority="46"/>
-    <w:lsdException w:name="List Table 2 Accent 2" w:uiPriority="47"/>
-    <w:lsdException w:name="List Table 3 Accent 2" w:uiPriority="48"/>
-    <w:lsdException w:name="List Table 4 Accent 2" w:uiPriority="49"/>
-    <w:lsdException w:name="List Table 5 Dark Accent 2" w:uiPriority="50"/>
-    <w:lsdException w:name="List Table 6 Colorful Accent 2" w:uiPriority="51"/>
-    <w:lsdException w:name="List Table 7 Colorful Accent 2" w:uiPriority="52"/>
-    <w:lsdException w:name="List Table 1 Light Accent 3" w:uiPriority="46"/>
-    <w:lsdException w:name="List Table 2 Accent 3" w:uiPriority="47"/>
-    <w:lsdException w:name="List Table 3 Accent 3" w:uiPriority="48"/>
-    <w:lsdException w:name="List Table 4 Accent 3" w:uiPriority="49"/>
-    <w:lsdException w:name="List Table 5 Dark Accent 3" w:uiPriority="50"/>
-    <w:lsdException w:name="List Table 6 Colorful Accent 3" w:uiPriority="51"/>
-    <w:lsdException w:name="List Table 7 Colorful Accent 3" w:uiPriority="52"/>
-    <w:lsdException w:name="List Table 1 Light Accent 4" w:uiPriority="46"/>
-    <w:lsdException w:name="List Table 2 Accent 4" w:uiPriority="47"/>
-    <w:lsdException w:name="List Table 3 Accent 4" w:uiPriority="48"/>
-    <w:lsdException w:name="List Table 4 Accent 4" w:uiPriority="49"/>
-    <w:lsdException w:name="List Table 5 Dark Accent 4" w:uiPriority="50"/>
-    <w:lsdException w:name="List Table 6 Colorful Accent 4" w:uiPriority="51"/>
-    <w:lsdException w:name="List Table 7 Colorful Accent 4" w:uiPriority="52"/>
-    <w:lsdException w:name="List Table 1 Light Accent 5" w:uiPriority="46"/>
-    <w:lsdException w:name="List Table 2 Accent 5" w:uiPriority="47"/>
-    <w:lsdException w:name="List Table 3 Accent 5" w:uiPriority="48"/>
-    <w:lsdException w:name="List Table 4 Accent 5" w:uiPriority="49"/>
-    <w:lsdException w:name="List Table 5 Dark Accent 5" w:uiPriority="50"/>
-    <w:lsdException w:name="List Table 6 Colorful Accent 5" w:uiPriority="51"/>
-    <w:lsdException w:name="List Table 7 Colorful Accent 5" w:uiPriority="52"/>
-    <w:lsdException w:name="List Table 1 Light Accent 6" w:uiPriority="46"/>
-    <w:lsdException w:name="List Table 2 Accent 6" w:uiPriority="47"/>
-    <w:lsdException w:name="List Table 3 Accent 6" w:uiPriority="48"/>
-    <w:lsdException w:name="List Table 4 Accent 6" w:uiPriority="49"/>
-    <w:lsdException w:name="List Table 5 Dark Accent 6" w:uiPriority="50"/>
-    <w:lsdException w:name="List Table 6 Colorful Accent 6" w:uiPriority="51"/>
-    <w:lsdException w:name="List Table 7 Colorful Accent 6" w:uiPriority="52"/>
-    <w:lsdException w:name="Mention" w:semiHidden="1" w:unhideWhenUsed="1"/>
-    <w:lsdException w:name="Smart Hyperlink" w:semiHidden="1" w:unhideWhenUsed="1"/>
-    <w:lsdException w:name="Hashtag" w:semiHidden="1" w:unhideWhenUsed="1"/>
-    <w:lsdException w:name="Unresolved Mention" w:semiHidden="1" w:unhideWhenUsed="1"/>
-    <w:lsdException w:name="Smart Link" w:semiHidden="1" w:unhideWhenUsed="1"/>
+  <w:latentStyles w:defLockedState="0" w:defUIPriority="99" w:defSemiHidden="1" w:defUnhideWhenUsed="1" w:defQFormat="0" w:count="267">
+    <w:lsdException w:name="Normal" w:semiHidden="0" w:uiPriority="0" w:unhideWhenUsed="0" w:qFormat="1"/>
+    <w:lsdException w:name="heading 1" w:semiHidden="0" w:uiPriority="9" w:unhideWhenUsed="0" w:qFormat="1"/>
+    <w:lsdException w:name="heading 2" w:uiPriority="9" w:qFormat="1"/>
+    <w:lsdException w:name="heading 3" w:uiPriority="9" w:qFormat="1"/>
+    <w:lsdException w:name="heading 4" w:uiPriority="9" w:qFormat="1"/>
+    <w:lsdException w:name="heading 5" w:uiPriority="9" w:qFormat="1"/>
+    <w:lsdException w:name="heading 6" w:uiPriority="9" w:qFormat="1"/>
+    <w:lsdException w:name="heading 7" w:uiPriority="9" w:qFormat="1"/>
+    <w:lsdException w:name="heading 8" w:uiPriority="9" w:qFormat="1"/>
+    <w:lsdException w:name="heading 9" w:uiPriority="9" w:qFormat="1"/>
+    <w:lsdException w:name="toc 1" w:uiPriority="39"/>
+    <w:lsdException w:name="toc 2" w:uiPriority="39"/>
+    <w:lsdException w:name="toc 3" w:uiPriority="39"/>
+    <w:lsdException w:name="toc 4" w:uiPriority="39"/>
+    <w:lsdException w:name="toc 5" w:uiPriority="39"/>
+    <w:lsdException w:name="toc 6" w:uiPriority="39"/>
+    <w:lsdException w:name="toc 7" w:uiPriority="39"/>
+    <w:lsdException w:name="toc 8" w:uiPriority="39"/>
+    <w:lsdException w:name="toc 9" w:uiPriority="39"/>
+    <w:lsdException w:name="caption" w:uiPriority="35" w:qFormat="1"/>
+    <w:lsdException w:name="Title" w:semiHidden="0" w:uiPriority="10" w:unhideWhenUsed="0" w:qFormat="1"/>
+    <w:lsdException w:name="Default Paragraph Font" w:uiPriority="1"/>
+    <w:lsdException w:name="Body Text" w:uiPriority="1" w:qFormat="1"/>
+    <w:lsdException w:name="Subtitle" w:semiHidden="0" w:uiPriority="11" w:unhideWhenUsed="0" w:qFormat="1"/>
+    <w:lsdException w:name="Strong" w:semiHidden="0" w:uiPriority="22" w:unhideWhenUsed="0" w:qFormat="1"/>
+    <w:lsdException w:name="Emphasis" w:semiHidden="0" w:uiPriority="20" w:unhideWhenUsed="0" w:qFormat="1"/>
+    <w:lsdException w:name="Table Grid" w:semiHidden="0" w:uiPriority="39" w:unhideWhenUsed="0"/>
+    <w:lsdException w:name="Placeholder Text" w:unhideWhenUsed="0"/>
+    <w:lsdException w:name="No Spacing" w:semiHidden="0" w:uiPriority="1" w:unhideWhenUsed="0" w:qFormat="1"/>
+    <w:lsdException w:name="Light Shading" w:semiHidden="0" w:uiPriority="60" w:unhideWhenUsed="0"/>
+    <w:lsdException w:name="Light List" w:semiHidden="0" w:uiPriority="61" w:unhideWhenUsed="0"/>
+    <w:lsdException w:name="Light Grid" w:semiHidden="0" w:uiPriority="62" w:unhideWhenUsed="0"/>
+    <w:lsdException w:name="Medium Shading 1" w:semiHidden="0" w:uiPriority="63" w:unhideWhenUsed="0"/>
+    <w:lsdException w:name="Medium Shading 2" w:semiHidden="0" w:uiPriority="64" w:unhideWhenUsed="0"/>
+    <w:lsdException w:name="Medium List 1" w:semiHidden="0" w:uiPriority="65" w:unhideWhenUsed="0"/>
+    <w:lsdException w:name="Medium List 2" w:semiHidden="0" w:uiPriority="66" w:unhideWhenUsed="0"/>
+    <w:lsdException w:name="Medium Grid 1" w:semiHidden="0" w:uiPriority="67" w:unhideWhenUsed="0"/>
+    <w:lsdException w:name="Medium Grid 2" w:semiHidden="0" w:uiPriority="68" w:unhideWhenUsed="0"/>
+    <w:lsdException w:name="Medium Grid 3" w:semiHidden="0" w:uiPriority="69" w:unhideWhenUsed="0"/>
+    <w:lsdException w:name="Dark List" w:semiHidden="0" w:uiPriority="70" w:unhideWhenUsed="0"/>
+    <w:lsdException w:name="Colorful Shading" w:semiHidden="0" w:uiPriority="71" w:unhideWhenUsed="0"/>
+    <w:lsdException w:name="Colorful List" w:semiHidden="0" w:uiPriority="72" w:unhideWhenUsed="0"/>
+    <w:lsdException w:name="Colorful Grid" w:semiHidden="0" w:uiPriority="73" w:unhideWhenUsed="0"/>
+    <w:lsdException w:name="Light Shading Accent 1" w:semiHidden="0" w:uiPriority="60" w:unhideWhenUsed="0"/>
+    <w:lsdException w:name="Light List Accent 1" w:semiHidden="0" w:uiPriority="61" w:unhideWhenUsed="0"/>
+    <w:lsdException w:name="Light Grid Accent 1" w:semiHidden="0" w:uiPriority="62" w:unhideWhenUsed="0"/>
+    <w:lsdException w:name="Medium Shading 1 Accent 1" w:semiHidden="0" w:uiPriority="63" w:unhideWhenUsed="0"/>
+    <w:lsdException w:name="Medium Shading 2 Accent 1" w:semiHidden="0" w:uiPriority="64" w:unhideWhenUsed="0"/>
+    <w:lsdException w:name="Medium List 1 Accent 1" w:semiHidden="0" w:uiPriority="65" w:unhideWhenUsed="0"/>
+    <w:lsdException w:name="Revision" w:unhideWhenUsed="0"/>
+    <w:lsdException w:name="List Paragraph" w:semiHidden="0" w:uiPriority="34" w:unhideWhenUsed="0" w:qFormat="1"/>
+    <w:lsdException w:name="Quote" w:semiHidden="0" w:uiPriority="29" w:unhideWhenUsed="0" w:qFormat="1"/>
+    <w:lsdException w:name="Intense Quote" w:semiHidden="0" w:uiPriority="30" w:unhideWhenUsed="0" w:qFormat="1"/>
+    <w:lsdException w:name="Medium List 2 Accent 1" w:semiHidden="0" w:uiPriority="66" w:unhideWhenUsed="0"/>
+    <w:lsdException w:name="Medium Grid 1 Accent 1" w:semiHidden="0" w:uiPriority="67" w:unhideWhenUsed="0"/>
+    <w:lsdException w:name="Medium Grid 2 Accent 1" w:semiHidden="0" w:uiPriority="68" w:unhideWhenUsed="0"/>
+    <w:lsdException w:name="Medium Grid 3 Accent 1" w:semiHidden="0" w:uiPriority="69" w:unhideWhenUsed="0"/>
+    <w:lsdException w:name="Dark List Accent 1" w:semiHidden="0" w:uiPriority="70" w:unhideWhenUsed="0"/>
+    <w:lsdException w:name="Colorful Shading Accent 1" w:semiHidden="0" w:uiPriority="71" w:unhideWhenUsed="0"/>
+    <w:lsdException w:name="Colorful List Accent 1" w:semiHidden="0" w:uiPriority="72" w:unhideWhenUsed="0"/>
+    <w:lsdException w:name="Colorful Grid Accent 1" w:semiHidden="0" w:uiPriority="73" w:unhideWhenUsed="0"/>
+    <w:lsdException w:name="Light Shading Accent 2" w:semiHidden="0" w:uiPriority="60" w:unhideWhenUsed="0"/>
+    <w:lsdException w:name="Light List Accent 2" w:semiHidden="0" w:uiPriority="61" w:unhideWhenUsed="0"/>
+    <w:lsdException w:name="Light Grid Accent 2" w:semiHidden="0" w:uiPriority="62" w:unhideWhenUsed="0"/>
+    <w:lsdException w:name="Medium Shading 1 Accent 2" w:semiHidden="0" w:uiPriority="63" w:unhideWhenUsed="0"/>
+    <w:lsdException w:name="Medium Shading 2 Accent 2" w:semiHidden="0" w:uiPriority="64" w:unhideWhenUsed="0"/>
+    <w:lsdException w:name="Medium List 1 Accent 2" w:semiHidden="0" w:uiPriority="65" w:unhideWhenUsed="0"/>
+    <w:lsdException w:name="Medium List 2 Accent 2" w:semiHidden="0" w:uiPriority="66" w:unhideWhenUsed="0"/>
+    <w:lsdException w:name="Medium Grid 1 Accent 2" w:semiHidden="0" w:uiPriority="67" w:unhideWhenUsed="0"/>
+    <w:lsdException w:name="Medium Grid 2 Accent 2" w:semiHidden="0" w:uiPriority="68" w:unhideWhenUsed="0"/>
+    <w:lsdException w:name="Medium Grid 3 Accent 2" w:semiHidden="0" w:uiPriority="69" w:unhideWhenUsed="0"/>
+    <w:lsdException w:name="Dark List Accent 2" w:semiHidden="0" w:uiPriority="70" w:unhideWhenUsed="0"/>
+    <w:lsdException w:name="Colorful Shading Accent 2" w:semiHidden="0" w:uiPriority="71" w:unhideWhenUsed="0"/>
+    <w:lsdException w:name="Colorful List Accent 2" w:semiHidden="0" w:uiPriority="72" w:unhideWhenUsed="0"/>
+    <w:lsdException w:name="Colorful Grid Accent 2" w:semiHidden="0" w:uiPriority="73" w:unhideWhenUsed="0"/>
+    <w:lsdException w:name="Light Shading Accent 3" w:semiHidden="0" w:uiPriority="60" w:unhideWhenUsed="0"/>
+    <w:lsdException w:name="Light List Accent 3" w:semiHidden="0" w:uiPriority="61" w:unhideWhenUsed="0"/>
+    <w:lsdException w:name="Light Grid Accent 3" w:semiHidden="0" w:uiPriority="62" w:unhideWhenUsed="0"/>
+    <w:lsdException w:name="Medium Shading 1 Accent 3" w:semiHidden="0" w:uiPriority="63" w:unhideWhenUsed="0"/>
+    <w:lsdException w:name="Medium Shading 2 Accent 3" w:semiHidden="0" w:uiPriority="64" w:unhideWhenUsed="0"/>
+    <w:lsdException w:name="Medium List 1 Accent 3" w:semiHidden="0" w:uiPriority="65" w:unhideWhenUsed="0"/>
+    <w:lsdException w:name="Medium List 2 Accent 3" w:semiHidden="0" w:uiPriority="66" w:unhideWhenUsed="0"/>
+    <w:lsdException w:name="Medium Grid 1 Accent 3" w:semiHidden="0" w:uiPriority="67" w:unhideWhenUsed="0"/>
+    <w:lsdException w:name="Medium Grid 2 Accent 3" w:semiHidden="0" w:uiPriority="68" w:unhideWhenUsed="0"/>
+    <w:lsdException w:name="Medium Grid 3 Accent 3" w:semiHidden="0" w:uiPriority="69" w:unhideWhenUsed="0"/>
+    <w:lsdException w:name="Dark List Accent 3" w:semiHidden="0" w:uiPriority="70" w:unhideWhenUsed="0"/>
+    <w:lsdException w:name="Colorful Shading Accent 3" w:semiHidden="0" w:uiPriority="71" w:unhideWhenUsed="0"/>
+    <w:lsdException w:name="Colorful List Accent 3" w:semiHidden="0" w:uiPriority="72" w:unhideWhenUsed="0"/>
+    <w:lsdException w:name="Colorful Grid Accent 3" w:semiHidden="0" w:uiPriority="73" w:unhideWhenUsed="0"/>
+    <w:lsdException w:name="Light Shading Accent 4" w:semiHidden="0" w:uiPriority="60" w:unhideWhenUsed="0"/>
+    <w:lsdException w:name="Light List Accent 4" w:semiHidden="0" w:uiPriority="61" w:unhideWhenUsed="0"/>
+    <w:lsdException w:name="Light Grid Accent 4" w:semiHidden="0" w:uiPriority="62" w:unhideWhenUsed="0"/>
+    <w:lsdException w:name="Medium Shading 1 Accent 4" w:semiHidden="0" w:uiPriority="63" w:unhideWhenUsed="0"/>
+    <w:lsdException w:name="Medium Shading 2 Accent 4" w:semiHidden="0" w:uiPriority="64" w:unhideWhenUsed="0"/>
+    <w:lsdException w:name="Medium List 1 Accent 4" w:semiHidden="0" w:uiPriority="65" w:unhideWhenUsed="0"/>
+    <w:lsdException w:name="Medium List 2 Accent 4" w:semiHidden="0" w:uiPriority="66" w:unhideWhenUsed="0"/>
+    <w:lsdException w:name="Medium Grid 1 Accent 4" w:semiHidden="0" w:uiPriority="67" w:unhideWhenUsed="0"/>
+    <w:lsdException w:name="Medium Grid 2 Accent 4" w:semiHidden="0" w:uiPriority="68" w:unhideWhenUsed="0"/>
+    <w:lsdException w:name="Medium Grid 3 Accent 4" w:semiHidden="0" w:uiPriority="69" w:unhideWhenUsed="0"/>
+    <w:lsdException w:name="Dark List Accent 4" w:semiHidden="0" w:uiPriority="70" w:unhideWhenUsed="0"/>
+    <w:lsdException w:name="Colorful Shading Accent 4" w:semiHidden="0" w:uiPriority="71" w:unhideWhenUsed="0"/>
+    <w:lsdException w:name="Colorful List Accent 4" w:semiHidden="0" w:uiPriority="72" w:unhideWhenUsed="0"/>
+    <w:lsdException w:name="Colorful Grid Accent 4" w:semiHidden="0" w:uiPriority="73" w:unhideWhenUsed="0"/>
+    <w:lsdException w:name="Light Shading Accent 5" w:semiHidden="0" w:uiPriority="60" w:unhideWhenUsed="0"/>
+    <w:lsdException w:name="Light List Accent 5" w:semiHidden="0" w:uiPriority="61" w:unhideWhenUsed="0"/>
+    <w:lsdException w:name="Light Grid Accent 5" w:semiHidden="0" w:uiPriority="62" w:unhideWhenUsed="0"/>
+    <w:lsdException w:name="Medium Shading 1 Accent 5" w:semiHidden="0" w:uiPriority="63" w:unhideWhenUsed="0"/>
+    <w:lsdException w:name="Medium Shading 2 Accent 5" w:semiHidden="0" w:uiPriority="64" w:unhideWhenUsed="0"/>
+    <w:lsdException w:name="Medium List 1 Accent 5" w:semiHidden="0" w:uiPriority="65" w:unhideWhenUsed="0"/>
+    <w:lsdException w:name="Medium List 2 Accent 5" w:semiHidden="0" w:uiPriority="66" w:unhideWhenUsed="0"/>
+    <w:lsdException w:name="Medium Grid 1 Accent 5" w:semiHidden="0" w:uiPriority="67" w:unhideWhenUsed="0"/>
+    <w:lsdException w:name="Medium Grid 2 Accent 5" w:semiHidden="0" w:uiPriority="68" w:unhideWhenUsed="0"/>
+    <w:lsdException w:name="Medium Grid 3 Accent 5" w:semiHidden="0" w:uiPriority="69" w:unhideWhenUsed="0"/>
+    <w:lsdException w:name="Dark List Accent 5" w:semiHidden="0" w:uiPriority="70" w:unhideWhenUsed="0"/>
+    <w:lsdException w:name="Colorful Shading Accent 5" w:semiHidden="0" w:uiPriority="71" w:unhideWhenUsed="0"/>
+    <w:lsdException w:name="Colorful List Accent 5" w:semiHidden="0" w:uiPriority="72" w:unhideWhenUsed="0"/>
+    <w:lsdException w:name="Colorful Grid Accent 5" w:semiHidden="0" w:uiPriority="73" w:unhideWhenUsed="0"/>
+    <w:lsdException w:name="Light Shading Accent 6" w:semiHidden="0" w:uiPriority="60" w:unhideWhenUsed="0"/>
+    <w:lsdException w:name="Light List Accent 6" w:semiHidden="0" w:uiPriority="61" w:unhideWhenUsed="0"/>
+    <w:lsdException w:name="Light Grid Accent 6" w:semiHidden="0" w:uiPriority="62" w:unhideWhenUsed="0"/>
+    <w:lsdException w:name="Medium Shading 1 Accent 6" w:semiHidden="0" w:uiPriority="63" w:unhideWhenUsed="0"/>
+    <w:lsdException w:name="Medium Shading 2 Accent 6" w:semiHidden="0" w:uiPriority="64" w:unhideWhenUsed="0"/>
+    <w:lsdException w:name="Medium List 1 Accent 6" w:semiHidden="0" w:uiPriority="65" w:unhideWhenUsed="0"/>
+    <w:lsdException w:name="Medium List 2 Accent 6" w:semiHidden="0" w:uiPriority="66" w:unhideWhenUsed="0"/>
+    <w:lsdException w:name="Medium Grid 1 Accent 6" w:semiHidden="0" w:uiPriority="67" w:unhideWhenUsed="0"/>
+    <w:lsdException w:name="Medium Grid 2 Accent 6" w:semiHidden="0" w:uiPriority="68" w:unhideWhenUsed="0"/>
+    <w:lsdException w:name="Medium Grid 3 Accent 6" w:semiHidden="0" w:uiPriority="69" w:unhideWhenUsed="0"/>
+    <w:lsdException w:name="Dark List Accent 6" w:semiHidden="0" w:uiPriority="70" w:unhideWhenUsed="0"/>
+    <w:lsdException w:name="Colorful Shading Accent 6" w:semiHidden="0" w:uiPriority="71" w:unhideWhenUsed="0"/>
+    <w:lsdException w:name="Colorful List Accent 6" w:semiHidden="0" w:uiPriority="72" w:unhideWhenUsed="0"/>
+    <w:lsdException w:name="Colorful Grid Accent 6" w:semiHidden="0" w:uiPriority="73" w:unhideWhenUsed="0"/>
+    <w:lsdException w:name="Subtle Emphasis" w:semiHidden="0" w:uiPriority="19" w:unhideWhenUsed="0" w:qFormat="1"/>
+    <w:lsdException w:name="Intense Emphasis" w:semiHidden="0" w:uiPriority="21" w:unhideWhenUsed="0" w:qFormat="1"/>
+    <w:lsdException w:name="Subtle Reference" w:semiHidden="0" w:uiPriority="31" w:unhideWhenUsed="0" w:qFormat="1"/>
+    <w:lsdException w:name="Intense Reference" w:semiHidden="0" w:uiPriority="32" w:unhideWhenUsed="0" w:qFormat="1"/>
+    <w:lsdException w:name="Book Title" w:semiHidden="0" w:uiPriority="33" w:unhideWhenUsed="0" w:qFormat="1"/>
+    <w:lsdException w:name="Bibliography" w:uiPriority="37"/>
+    <w:lsdException w:name="TOC Heading" w:uiPriority="39" w:qFormat="1"/>
   </w:latentStyles>
   <w:style w:type="paragraph" w:default="1" w:styleId="Normal">
     <w:name w:val="Normal"/>
@@ -26621,6 +26555,7 @@
       <w:spacing w:after="0" w:line="240" w:lineRule="auto"/>
     </w:pPr>
     <w:tblPr>
+      <w:tblInd w:w="0" w:type="dxa"/>
       <w:tblBorders>
         <w:top w:val="single" w:sz="4" w:space="0" w:color="auto"/>
         <w:left w:val="single" w:sz="4" w:space="0" w:color="auto"/>
@@ -26629,6 +26564,12 @@
         <w:insideH w:val="single" w:sz="4" w:space="0" w:color="auto"/>
         <w:insideV w:val="single" w:sz="4" w:space="0" w:color="auto"/>
       </w:tblBorders>
+      <w:tblCellMar>
+        <w:top w:w="0" w:type="dxa"/>
+        <w:left w:w="108" w:type="dxa"/>
+        <w:bottom w:w="0" w:type="dxa"/>
+        <w:right w:w="108" w:type="dxa"/>
+      </w:tblCellMar>
     </w:tblPr>
   </w:style>
   <w:style w:type="table" w:customStyle="1" w:styleId="Tablaconcuadrcula1">
@@ -26641,6 +26582,7 @@
       <w:spacing w:after="0" w:line="240" w:lineRule="auto"/>
     </w:pPr>
     <w:tblPr>
+      <w:tblInd w:w="0" w:type="dxa"/>
       <w:tblBorders>
         <w:top w:val="single" w:sz="4" w:space="0" w:color="auto"/>
         <w:left w:val="single" w:sz="4" w:space="0" w:color="auto"/>
@@ -26649,7 +26591,439 @@
         <w:insideH w:val="single" w:sz="4" w:space="0" w:color="auto"/>
         <w:insideV w:val="single" w:sz="4" w:space="0" w:color="auto"/>
       </w:tblBorders>
+      <w:tblCellMar>
+        <w:top w:w="0" w:type="dxa"/>
+        <w:left w:w="108" w:type="dxa"/>
+        <w:bottom w:w="0" w:type="dxa"/>
+        <w:right w:w="108" w:type="dxa"/>
+      </w:tblCellMar>
     </w:tblPr>
+  </w:style>
+  <w:style w:type="paragraph" w:styleId="Textodeglobo">
+    <w:name w:val="Balloon Text"/>
+    <w:basedOn w:val="Normal"/>
+    <w:link w:val="TextodegloboCar"/>
+    <w:uiPriority w:val="99"/>
+    <w:semiHidden/>
+    <w:unhideWhenUsed/>
+    <w:rsid w:val="00775602"/>
+    <w:pPr>
+      <w:spacing w:after="0" w:line="240" w:lineRule="auto"/>
+    </w:pPr>
+    <w:rPr>
+      <w:rFonts w:ascii="Tahoma" w:hAnsi="Tahoma" w:cs="Tahoma"/>
+      <w:sz w:val="16"/>
+      <w:szCs w:val="16"/>
+    </w:rPr>
+  </w:style>
+  <w:style w:type="character" w:customStyle="1" w:styleId="TextodegloboCar">
+    <w:name w:val="Texto de globo Car"/>
+    <w:basedOn w:val="Fuentedeprrafopredeter"/>
+    <w:link w:val="Textodeglobo"/>
+    <w:uiPriority w:val="99"/>
+    <w:semiHidden/>
+    <w:rsid w:val="00775602"/>
+    <w:rPr>
+      <w:rFonts w:ascii="Tahoma" w:hAnsi="Tahoma" w:cs="Tahoma"/>
+      <w:sz w:val="16"/>
+      <w:szCs w:val="16"/>
+    </w:rPr>
+  </w:style>
+</w:styles>
+</file>
+
+<file path=word/stylesWithEffects.xml><?xml version="1.0" encoding="utf-8"?>
+<w:styles xmlns:wpc="http://schemas.microsoft.com/office/word/2010/wordprocessingCanvas" xmlns:mc="http://schemas.openxmlformats.org/markup-compatibility/2006" xmlns:o="urn:schemas-microsoft-com:office:office" xmlns:r="http://schemas.openxmlformats.org/officeDocument/2006/relationships" xmlns:m="http://schemas.openxmlformats.org/officeDocument/2006/math" xmlns:v="urn:schemas-microsoft-com:vml" xmlns:wp14="http://schemas.microsoft.com/office/word/2010/wordprocessingDrawing" xmlns:wp="http://schemas.openxmlformats.org/drawingml/2006/wordprocessingDrawing" xmlns:w10="urn:schemas-microsoft-com:office:word" xmlns:w="http://schemas.openxmlformats.org/wordprocessingml/2006/main" xmlns:w14="http://schemas.microsoft.com/office/word/2010/wordml" xmlns:wpg="http://schemas.microsoft.com/office/word/2010/wordprocessingGroup" xmlns:wpi="http://schemas.microsoft.com/office/word/2010/wordprocessingInk" xmlns:wne="http://schemas.microsoft.com/office/word/2006/wordml" xmlns:wps="http://schemas.microsoft.com/office/word/2010/wordprocessingShape" mc:Ignorable="w14 wp14">
+  <w:docDefaults>
+    <w:rPrDefault>
+      <w:rPr>
+        <w:rFonts w:asciiTheme="minorHAnsi" w:eastAsiaTheme="minorHAnsi" w:hAnsiTheme="minorHAnsi" w:cstheme="minorBidi"/>
+        <w:kern w:val="2"/>
+        <w:sz w:val="24"/>
+        <w:szCs w:val="24"/>
+        <w:lang w:val="es-US" w:eastAsia="en-US" w:bidi="ar-SA"/>
+        <w14:ligatures w14:val="standardContextual"/>
+      </w:rPr>
+    </w:rPrDefault>
+    <w:pPrDefault>
+      <w:pPr>
+        <w:spacing w:after="160" w:line="278" w:lineRule="auto"/>
+      </w:pPr>
+    </w:pPrDefault>
+  </w:docDefaults>
+  <w:latentStyles w:defLockedState="0" w:defUIPriority="99" w:defSemiHidden="1" w:defUnhideWhenUsed="1" w:defQFormat="0" w:count="267">
+    <w:lsdException w:name="Normal" w:semiHidden="0" w:uiPriority="0" w:unhideWhenUsed="0" w:qFormat="1"/>
+    <w:lsdException w:name="heading 1" w:semiHidden="0" w:uiPriority="9" w:unhideWhenUsed="0" w:qFormat="1"/>
+    <w:lsdException w:name="heading 2" w:uiPriority="9" w:qFormat="1"/>
+    <w:lsdException w:name="heading 3" w:uiPriority="9" w:qFormat="1"/>
+    <w:lsdException w:name="heading 4" w:uiPriority="9" w:qFormat="1"/>
+    <w:lsdException w:name="heading 5" w:uiPriority="9" w:qFormat="1"/>
+    <w:lsdException w:name="heading 6" w:uiPriority="9" w:qFormat="1"/>
+    <w:lsdException w:name="heading 7" w:uiPriority="9" w:qFormat="1"/>
+    <w:lsdException w:name="heading 8" w:uiPriority="9" w:qFormat="1"/>
+    <w:lsdException w:name="heading 9" w:uiPriority="9" w:qFormat="1"/>
+    <w:lsdException w:name="toc 1" w:uiPriority="39"/>
+    <w:lsdException w:name="toc 2" w:uiPriority="39"/>
+    <w:lsdException w:name="toc 3" w:uiPriority="39"/>
+    <w:lsdException w:name="toc 4" w:uiPriority="39"/>
+    <w:lsdException w:name="toc 5" w:uiPriority="39"/>
+    <w:lsdException w:name="toc 6" w:uiPriority="39"/>
+    <w:lsdException w:name="toc 7" w:uiPriority="39"/>
+    <w:lsdException w:name="toc 8" w:uiPriority="39"/>
+    <w:lsdException w:name="toc 9" w:uiPriority="39"/>
+    <w:lsdException w:name="caption" w:uiPriority="35" w:qFormat="1"/>
+    <w:lsdException w:name="Title" w:semiHidden="0" w:uiPriority="10" w:unhideWhenUsed="0" w:qFormat="1"/>
+    <w:lsdException w:name="Default Paragraph Font" w:uiPriority="1"/>
+    <w:lsdException w:name="Body Text" w:uiPriority="1" w:qFormat="1"/>
+    <w:lsdException w:name="Subtitle" w:semiHidden="0" w:uiPriority="11" w:unhideWhenUsed="0" w:qFormat="1"/>
+    <w:lsdException w:name="Strong" w:semiHidden="0" w:uiPriority="22" w:unhideWhenUsed="0" w:qFormat="1"/>
+    <w:lsdException w:name="Emphasis" w:semiHidden="0" w:uiPriority="20" w:unhideWhenUsed="0" w:qFormat="1"/>
+    <w:lsdException w:name="Table Grid" w:semiHidden="0" w:uiPriority="39" w:unhideWhenUsed="0"/>
+    <w:lsdException w:name="Placeholder Text" w:unhideWhenUsed="0"/>
+    <w:lsdException w:name="No Spacing" w:semiHidden="0" w:uiPriority="1" w:unhideWhenUsed="0" w:qFormat="1"/>
+    <w:lsdException w:name="Light Shading" w:semiHidden="0" w:uiPriority="60" w:unhideWhenUsed="0"/>
+    <w:lsdException w:name="Light List" w:semiHidden="0" w:uiPriority="61" w:unhideWhenUsed="0"/>
+    <w:lsdException w:name="Light Grid" w:semiHidden="0" w:uiPriority="62" w:unhideWhenUsed="0"/>
+    <w:lsdException w:name="Medium Shading 1" w:semiHidden="0" w:uiPriority="63" w:unhideWhenUsed="0"/>
+    <w:lsdException w:name="Medium Shading 2" w:semiHidden="0" w:uiPriority="64" w:unhideWhenUsed="0"/>
+    <w:lsdException w:name="Medium List 1" w:semiHidden="0" w:uiPriority="65" w:unhideWhenUsed="0"/>
+    <w:lsdException w:name="Medium List 2" w:semiHidden="0" w:uiPriority="66" w:unhideWhenUsed="0"/>
+    <w:lsdException w:name="Medium Grid 1" w:semiHidden="0" w:uiPriority="67" w:unhideWhenUsed="0"/>
+    <w:lsdException w:name="Medium Grid 2" w:semiHidden="0" w:uiPriority="68" w:unhideWhenUsed="0"/>
+    <w:lsdException w:name="Medium Grid 3" w:semiHidden="0" w:uiPriority="69" w:unhideWhenUsed="0"/>
+    <w:lsdException w:name="Dark List" w:semiHidden="0" w:uiPriority="70" w:unhideWhenUsed="0"/>
+    <w:lsdException w:name="Colorful Shading" w:semiHidden="0" w:uiPriority="71" w:unhideWhenUsed="0"/>
+    <w:lsdException w:name="Colorful List" w:semiHidden="0" w:uiPriority="72" w:unhideWhenUsed="0"/>
+    <w:lsdException w:name="Colorful Grid" w:semiHidden="0" w:uiPriority="73" w:unhideWhenUsed="0"/>
+    <w:lsdException w:name="Light Shading Accent 1" w:semiHidden="0" w:uiPriority="60" w:unhideWhenUsed="0"/>
+    <w:lsdException w:name="Light List Accent 1" w:semiHidden="0" w:uiPriority="61" w:unhideWhenUsed="0"/>
+    <w:lsdException w:name="Light Grid Accent 1" w:semiHidden="0" w:uiPriority="62" w:unhideWhenUsed="0"/>
+    <w:lsdException w:name="Medium Shading 1 Accent 1" w:semiHidden="0" w:uiPriority="63" w:unhideWhenUsed="0"/>
+    <w:lsdException w:name="Medium Shading 2 Accent 1" w:semiHidden="0" w:uiPriority="64" w:unhideWhenUsed="0"/>
+    <w:lsdException w:name="Medium List 1 Accent 1" w:semiHidden="0" w:uiPriority="65" w:unhideWhenUsed="0"/>
+    <w:lsdException w:name="Revision" w:unhideWhenUsed="0"/>
+    <w:lsdException w:name="List Paragraph" w:semiHidden="0" w:uiPriority="34" w:unhideWhenUsed="0" w:qFormat="1"/>
+    <w:lsdException w:name="Quote" w:semiHidden="0" w:uiPriority="29" w:unhideWhenUsed="0" w:qFormat="1"/>
+    <w:lsdException w:name="Intense Quote" w:semiHidden="0" w:uiPriority="30" w:unhideWhenUsed="0" w:qFormat="1"/>
+    <w:lsdException w:name="Medium List 2 Accent 1" w:semiHidden="0" w:uiPriority="66" w:unhideWhenUsed="0"/>
+    <w:lsdException w:name="Medium Grid 1 Accent 1" w:semiHidden="0" w:uiPriority="67" w:unhideWhenUsed="0"/>
+    <w:lsdException w:name="Medium Grid 2 Accent 1" w:semiHidden="0" w:uiPriority="68" w:unhideWhenUsed="0"/>
+    <w:lsdException w:name="Medium Grid 3 Accent 1" w:semiHidden="0" w:uiPriority="69" w:unhideWhenUsed="0"/>
+    <w:lsdException w:name="Dark List Accent 1" w:semiHidden="0" w:uiPriority="70" w:unhideWhenUsed="0"/>
+    <w:lsdException w:name="Colorful Shading Accent 1" w:semiHidden="0" w:uiPriority="71" w:unhideWhenUsed="0"/>
+    <w:lsdException w:name="Colorful List Accent 1" w:semiHidden="0" w:uiPriority="72" w:unhideWhenUsed="0"/>
+    <w:lsdException w:name="Colorful Grid Accent 1" w:semiHidden="0" w:uiPriority="73" w:unhideWhenUsed="0"/>
+    <w:lsdException w:name="Light Shading Accent 2" w:semiHidden="0" w:uiPriority="60" w:unhideWhenUsed="0"/>
+    <w:lsdException w:name="Light List Accent 2" w:semiHidden="0" w:uiPriority="61" w:unhideWhenUsed="0"/>
+    <w:lsdException w:name="Light Grid Accent 2" w:semiHidden="0" w:uiPriority="62" w:unhideWhenUsed="0"/>
+    <w:lsdException w:name="Medium Shading 1 Accent 2" w:semiHidden="0" w:uiPriority="63" w:unhideWhenUsed="0"/>
+    <w:lsdException w:name="Medium Shading 2 Accent 2" w:semiHidden="0" w:uiPriority="64" w:unhideWhenUsed="0"/>
+    <w:lsdException w:name="Medium List 1 Accent 2" w:semiHidden="0" w:uiPriority="65" w:unhideWhenUsed="0"/>
+    <w:lsdException w:name="Medium List 2 Accent 2" w:semiHidden="0" w:uiPriority="66" w:unhideWhenUsed="0"/>
+    <w:lsdException w:name="Medium Grid 1 Accent 2" w:semiHidden="0" w:uiPriority="67" w:unhideWhenUsed="0"/>
+    <w:lsdException w:name="Medium Grid 2 Accent 2" w:semiHidden="0" w:uiPriority="68" w:unhideWhenUsed="0"/>
+    <w:lsdException w:name="Medium Grid 3 Accent 2" w:semiHidden="0" w:uiPriority="69" w:unhideWhenUsed="0"/>
+    <w:lsdException w:name="Dark List Accent 2" w:semiHidden="0" w:uiPriority="70" w:unhideWhenUsed="0"/>
+    <w:lsdException w:name="Colorful Shading Accent 2" w:semiHidden="0" w:uiPriority="71" w:unhideWhenUsed="0"/>
+    <w:lsdException w:name="Colorful List Accent 2" w:semiHidden="0" w:uiPriority="72" w:unhideWhenUsed="0"/>
+    <w:lsdException w:name="Colorful Grid Accent 2" w:semiHidden="0" w:uiPriority="73" w:unhideWhenUsed="0"/>
+    <w:lsdException w:name="Light Shading Accent 3" w:semiHidden="0" w:uiPriority="60" w:unhideWhenUsed="0"/>
+    <w:lsdException w:name="Light List Accent 3" w:semiHidden="0" w:uiPriority="61" w:unhideWhenUsed="0"/>
+    <w:lsdException w:name="Light Grid Accent 3" w:semiHidden="0" w:uiPriority="62" w:unhideWhenUsed="0"/>
+    <w:lsdException w:name="Medium Shading 1 Accent 3" w:semiHidden="0" w:uiPriority="63" w:unhideWhenUsed="0"/>
+    <w:lsdException w:name="Medium Shading 2 Accent 3" w:semiHidden="0" w:uiPriority="64" w:unhideWhenUsed="0"/>
+    <w:lsdException w:name="Medium List 1 Accent 3" w:semiHidden="0" w:uiPriority="65" w:unhideWhenUsed="0"/>
+    <w:lsdException w:name="Medium List 2 Accent 3" w:semiHidden="0" w:uiPriority="66" w:unhideWhenUsed="0"/>
+    <w:lsdException w:name="Medium Grid 1 Accent 3" w:semiHidden="0" w:uiPriority="67" w:unhideWhenUsed="0"/>
+    <w:lsdException w:name="Medium Grid 2 Accent 3" w:semiHidden="0" w:uiPriority="68" w:unhideWhenUsed="0"/>
+    <w:lsdException w:name="Medium Grid 3 Accent 3" w:semiHidden="0" w:uiPriority="69" w:unhideWhenUsed="0"/>
+    <w:lsdException w:name="Dark List Accent 3" w:semiHidden="0" w:uiPriority="70" w:unhideWhenUsed="0"/>
+    <w:lsdException w:name="Colorful Shading Accent 3" w:semiHidden="0" w:uiPriority="71" w:unhideWhenUsed="0"/>
+    <w:lsdException w:name="Colorful List Accent 3" w:semiHidden="0" w:uiPriority="72" w:unhideWhenUsed="0"/>
+    <w:lsdException w:name="Colorful Grid Accent 3" w:semiHidden="0" w:uiPriority="73" w:unhideWhenUsed="0"/>
+    <w:lsdException w:name="Light Shading Accent 4" w:semiHidden="0" w:uiPriority="60" w:unhideWhenUsed="0"/>
+    <w:lsdException w:name="Light List Accent 4" w:semiHidden="0" w:uiPriority="61" w:unhideWhenUsed="0"/>
+    <w:lsdException w:name="Light Grid Accent 4" w:semiHidden="0" w:uiPriority="62" w:unhideWhenUsed="0"/>
+    <w:lsdException w:name="Medium Shading 1 Accent 4" w:semiHidden="0" w:uiPriority="63" w:unhideWhenUsed="0"/>
+    <w:lsdException w:name="Medium Shading 2 Accent 4" w:semiHidden="0" w:uiPriority="64" w:unhideWhenUsed="0"/>
+    <w:lsdException w:name="Medium List 1 Accent 4" w:semiHidden="0" w:uiPriority="65" w:unhideWhenUsed="0"/>
+    <w:lsdException w:name="Medium List 2 Accent 4" w:semiHidden="0" w:uiPriority="66" w:unhideWhenUsed="0"/>
+    <w:lsdException w:name="Medium Grid 1 Accent 4" w:semiHidden="0" w:uiPriority="67" w:unhideWhenUsed="0"/>
+    <w:lsdException w:name="Medium Grid 2 Accent 4" w:semiHidden="0" w:uiPriority="68" w:unhideWhenUsed="0"/>
+    <w:lsdException w:name="Medium Grid 3 Accent 4" w:semiHidden="0" w:uiPriority="69" w:unhideWhenUsed="0"/>
+    <w:lsdException w:name="Dark List Accent 4" w:semiHidden="0" w:uiPriority="70" w:unhideWhenUsed="0"/>
+    <w:lsdException w:name="Colorful Shading Accent 4" w:semiHidden="0" w:uiPriority="71" w:unhideWhenUsed="0"/>
+    <w:lsdException w:name="Colorful List Accent 4" w:semiHidden="0" w:uiPriority="72" w:unhideWhenUsed="0"/>
+    <w:lsdException w:name="Colorful Grid Accent 4" w:semiHidden="0" w:uiPriority="73" w:unhideWhenUsed="0"/>
+    <w:lsdException w:name="Light Shading Accent 5" w:semiHidden="0" w:uiPriority="60" w:unhideWhenUsed="0"/>
+    <w:lsdException w:name="Light List Accent 5" w:semiHidden="0" w:uiPriority="61" w:unhideWhenUsed="0"/>
+    <w:lsdException w:name="Light Grid Accent 5" w:semiHidden="0" w:uiPriority="62" w:unhideWhenUsed="0"/>
+    <w:lsdException w:name="Medium Shading 1 Accent 5" w:semiHidden="0" w:uiPriority="63" w:unhideWhenUsed="0"/>
+    <w:lsdException w:name="Medium Shading 2 Accent 5" w:semiHidden="0" w:uiPriority="64" w:unhideWhenUsed="0"/>
+    <w:lsdException w:name="Medium List 1 Accent 5" w:semiHidden="0" w:uiPriority="65" w:unhideWhenUsed="0"/>
+    <w:lsdException w:name="Medium List 2 Accent 5" w:semiHidden="0" w:uiPriority="66" w:unhideWhenUsed="0"/>
+    <w:lsdException w:name="Medium Grid 1 Accent 5" w:semiHidden="0" w:uiPriority="67" w:unhideWhenUsed="0"/>
+    <w:lsdException w:name="Medium Grid 2 Accent 5" w:semiHidden="0" w:uiPriority="68" w:unhideWhenUsed="0"/>
+    <w:lsdException w:name="Medium Grid 3 Accent 5" w:semiHidden="0" w:uiPriority="69" w:unhideWhenUsed="0"/>
+    <w:lsdException w:name="Dark List Accent 5" w:semiHidden="0" w:uiPriority="70" w:unhideWhenUsed="0"/>
+    <w:lsdException w:name="Colorful Shading Accent 5" w:semiHidden="0" w:uiPriority="71" w:unhideWhenUsed="0"/>
+    <w:lsdException w:name="Colorful List Accent 5" w:semiHidden="0" w:uiPriority="72" w:unhideWhenUsed="0"/>
+    <w:lsdException w:name="Colorful Grid Accent 5" w:semiHidden="0" w:uiPriority="73" w:unhideWhenUsed="0"/>
+    <w:lsdException w:name="Light Shading Accent 6" w:semiHidden="0" w:uiPriority="60" w:unhideWhenUsed="0"/>
+    <w:lsdException w:name="Light List Accent 6" w:semiHidden="0" w:uiPriority="61" w:unhideWhenUsed="0"/>
+    <w:lsdException w:name="Light Grid Accent 6" w:semiHidden="0" w:uiPriority="62" w:unhideWhenUsed="0"/>
+    <w:lsdException w:name="Medium Shading 1 Accent 6" w:semiHidden="0" w:uiPriority="63" w:unhideWhenUsed="0"/>
+    <w:lsdException w:name="Medium Shading 2 Accent 6" w:semiHidden="0" w:uiPriority="64" w:unhideWhenUsed="0"/>
+    <w:lsdException w:name="Medium List 1 Accent 6" w:semiHidden="0" w:uiPriority="65" w:unhideWhenUsed="0"/>
+    <w:lsdException w:name="Medium List 2 Accent 6" w:semiHidden="0" w:uiPriority="66" w:unhideWhenUsed="0"/>
+    <w:lsdException w:name="Medium Grid 1 Accent 6" w:semiHidden="0" w:uiPriority="67" w:unhideWhenUsed="0"/>
+    <w:lsdException w:name="Medium Grid 2 Accent 6" w:semiHidden="0" w:uiPriority="68" w:unhideWhenUsed="0"/>
+    <w:lsdException w:name="Medium Grid 3 Accent 6" w:semiHidden="0" w:uiPriority="69" w:unhideWhenUsed="0"/>
+    <w:lsdException w:name="Dark List Accent 6" w:semiHidden="0" w:uiPriority="70" w:unhideWhenUsed="0"/>
+    <w:lsdException w:name="Colorful Shading Accent 6" w:semiHidden="0" w:uiPriority="71" w:unhideWhenUsed="0"/>
+    <w:lsdException w:name="Colorful List Accent 6" w:semiHidden="0" w:uiPriority="72" w:unhideWhenUsed="0"/>
+    <w:lsdException w:name="Colorful Grid Accent 6" w:semiHidden="0" w:uiPriority="73" w:unhideWhenUsed="0"/>
+    <w:lsdException w:name="Subtle Emphasis" w:semiHidden="0" w:uiPriority="19" w:unhideWhenUsed="0" w:qFormat="1"/>
+    <w:lsdException w:name="Intense Emphasis" w:semiHidden="0" w:uiPriority="21" w:unhideWhenUsed="0" w:qFormat="1"/>
+    <w:lsdException w:name="Subtle Reference" w:semiHidden="0" w:uiPriority="31" w:unhideWhenUsed="0" w:qFormat="1"/>
+    <w:lsdException w:name="Intense Reference" w:semiHidden="0" w:uiPriority="32" w:unhideWhenUsed="0" w:qFormat="1"/>
+    <w:lsdException w:name="Book Title" w:semiHidden="0" w:uiPriority="33" w:unhideWhenUsed="0" w:qFormat="1"/>
+    <w:lsdException w:name="Bibliography" w:uiPriority="37"/>
+    <w:lsdException w:name="TOC Heading" w:uiPriority="39" w:qFormat="1"/>
+  </w:latentStyles>
+  <w:style w:type="paragraph" w:default="1" w:styleId="Normal">
+    <w:name w:val="Normal"/>
+    <w:qFormat/>
+    <w:rsid w:val="00BD0A71"/>
+    <w:pPr>
+      <w:spacing w:line="276" w:lineRule="auto"/>
+    </w:pPr>
+  </w:style>
+  <w:style w:type="paragraph" w:styleId="Ttulo1">
+    <w:name w:val="heading 1"/>
+    <w:basedOn w:val="Normal"/>
+    <w:next w:val="Normal"/>
+    <w:link w:val="Ttulo1Car"/>
+    <w:uiPriority w:val="9"/>
+    <w:qFormat/>
+    <w:rsid w:val="00571F4C"/>
+    <w:pPr>
+      <w:keepNext/>
+      <w:keepLines/>
+      <w:spacing w:before="240" w:after="0"/>
+      <w:outlineLvl w:val="0"/>
+    </w:pPr>
+    <w:rPr>
+      <w:rFonts w:asciiTheme="majorHAnsi" w:eastAsiaTheme="majorEastAsia" w:hAnsiTheme="majorHAnsi" w:cstheme="majorBidi"/>
+      <w:color w:val="2F5496" w:themeColor="accent1" w:themeShade="BF"/>
+      <w:sz w:val="32"/>
+      <w:szCs w:val="32"/>
+    </w:rPr>
+  </w:style>
+  <w:style w:type="paragraph" w:styleId="Ttulo2">
+    <w:name w:val="heading 2"/>
+    <w:basedOn w:val="Normal"/>
+    <w:next w:val="Normal"/>
+    <w:link w:val="Ttulo2Car"/>
+    <w:uiPriority w:val="9"/>
+    <w:unhideWhenUsed/>
+    <w:qFormat/>
+    <w:rsid w:val="00571F4C"/>
+    <w:pPr>
+      <w:keepNext/>
+      <w:keepLines/>
+      <w:spacing w:before="40" w:after="0"/>
+      <w:outlineLvl w:val="1"/>
+    </w:pPr>
+    <w:rPr>
+      <w:rFonts w:asciiTheme="majorHAnsi" w:eastAsiaTheme="majorEastAsia" w:hAnsiTheme="majorHAnsi" w:cstheme="majorBidi"/>
+      <w:color w:val="2F5496" w:themeColor="accent1" w:themeShade="BF"/>
+      <w:sz w:val="26"/>
+      <w:szCs w:val="26"/>
+    </w:rPr>
+  </w:style>
+  <w:style w:type="character" w:default="1" w:styleId="Fuentedeprrafopredeter">
+    <w:name w:val="Default Paragraph Font"/>
+    <w:uiPriority w:val="1"/>
+    <w:semiHidden/>
+    <w:unhideWhenUsed/>
+  </w:style>
+  <w:style w:type="table" w:default="1" w:styleId="Tablanormal">
+    <w:name w:val="Normal Table"/>
+    <w:uiPriority w:val="99"/>
+    <w:semiHidden/>
+    <w:unhideWhenUsed/>
+    <w:tblPr>
+      <w:tblInd w:w="0" w:type="dxa"/>
+      <w:tblCellMar>
+        <w:top w:w="0" w:type="dxa"/>
+        <w:left w:w="108" w:type="dxa"/>
+        <w:bottom w:w="0" w:type="dxa"/>
+        <w:right w:w="108" w:type="dxa"/>
+      </w:tblCellMar>
+    </w:tblPr>
+  </w:style>
+  <w:style w:type="numbering" w:default="1" w:styleId="Sinlista">
+    <w:name w:val="No List"/>
+    <w:uiPriority w:val="99"/>
+    <w:semiHidden/>
+    <w:unhideWhenUsed/>
+  </w:style>
+  <w:style w:type="character" w:customStyle="1" w:styleId="Ttulo1Car">
+    <w:name w:val="Título 1 Car"/>
+    <w:basedOn w:val="Fuentedeprrafopredeter"/>
+    <w:link w:val="Ttulo1"/>
+    <w:uiPriority w:val="9"/>
+    <w:rsid w:val="00571F4C"/>
+    <w:rPr>
+      <w:rFonts w:asciiTheme="majorHAnsi" w:eastAsiaTheme="majorEastAsia" w:hAnsiTheme="majorHAnsi" w:cstheme="majorBidi"/>
+      <w:color w:val="2F5496" w:themeColor="accent1" w:themeShade="BF"/>
+      <w:sz w:val="32"/>
+      <w:szCs w:val="32"/>
+    </w:rPr>
+  </w:style>
+  <w:style w:type="character" w:customStyle="1" w:styleId="Ttulo2Car">
+    <w:name w:val="Título 2 Car"/>
+    <w:basedOn w:val="Fuentedeprrafopredeter"/>
+    <w:link w:val="Ttulo2"/>
+    <w:uiPriority w:val="9"/>
+    <w:rsid w:val="00571F4C"/>
+    <w:rPr>
+      <w:rFonts w:asciiTheme="majorHAnsi" w:eastAsiaTheme="majorEastAsia" w:hAnsiTheme="majorHAnsi" w:cstheme="majorBidi"/>
+      <w:color w:val="2F5496" w:themeColor="accent1" w:themeShade="BF"/>
+      <w:sz w:val="26"/>
+      <w:szCs w:val="26"/>
+    </w:rPr>
+  </w:style>
+  <w:style w:type="paragraph" w:styleId="Textoindependiente">
+    <w:name w:val="Body Text"/>
+    <w:basedOn w:val="Normal"/>
+    <w:link w:val="TextoindependienteCar"/>
+    <w:uiPriority w:val="1"/>
+    <w:semiHidden/>
+    <w:unhideWhenUsed/>
+    <w:qFormat/>
+    <w:rsid w:val="00571F4C"/>
+    <w:pPr>
+      <w:widowControl w:val="0"/>
+      <w:autoSpaceDE w:val="0"/>
+      <w:autoSpaceDN w:val="0"/>
+      <w:spacing w:after="0" w:line="240" w:lineRule="auto"/>
+    </w:pPr>
+    <w:rPr>
+      <w:rFonts w:ascii="Arial MT" w:eastAsia="Arial MT" w:hAnsi="Arial MT" w:cs="Arial MT"/>
+      <w:kern w:val="0"/>
+      <w:lang w:val="es-ES"/>
+      <w14:ligatures w14:val="none"/>
+    </w:rPr>
+  </w:style>
+  <w:style w:type="character" w:customStyle="1" w:styleId="TextoindependienteCar">
+    <w:name w:val="Texto independiente Car"/>
+    <w:basedOn w:val="Fuentedeprrafopredeter"/>
+    <w:link w:val="Textoindependiente"/>
+    <w:uiPriority w:val="1"/>
+    <w:semiHidden/>
+    <w:rsid w:val="00571F4C"/>
+    <w:rPr>
+      <w:rFonts w:ascii="Arial MT" w:eastAsia="Arial MT" w:hAnsi="Arial MT" w:cs="Arial MT"/>
+      <w:kern w:val="0"/>
+      <w:lang w:val="es-ES"/>
+      <w14:ligatures w14:val="none"/>
+    </w:rPr>
+  </w:style>
+  <w:style w:type="paragraph" w:styleId="Prrafodelista">
+    <w:name w:val="List Paragraph"/>
+    <w:basedOn w:val="Normal"/>
+    <w:uiPriority w:val="34"/>
+    <w:qFormat/>
+    <w:rsid w:val="00571F4C"/>
+    <w:pPr>
+      <w:ind w:left="720"/>
+      <w:contextualSpacing/>
+    </w:pPr>
+  </w:style>
+  <w:style w:type="table" w:styleId="Tablaconcuadrcula">
+    <w:name w:val="Table Grid"/>
+    <w:basedOn w:val="Tablanormal"/>
+    <w:uiPriority w:val="39"/>
+    <w:rsid w:val="00571F4C"/>
+    <w:pPr>
+      <w:spacing w:after="0" w:line="240" w:lineRule="auto"/>
+    </w:pPr>
+    <w:tblPr>
+      <w:tblInd w:w="0" w:type="dxa"/>
+      <w:tblBorders>
+        <w:top w:val="single" w:sz="4" w:space="0" w:color="auto"/>
+        <w:left w:val="single" w:sz="4" w:space="0" w:color="auto"/>
+        <w:bottom w:val="single" w:sz="4" w:space="0" w:color="auto"/>
+        <w:right w:val="single" w:sz="4" w:space="0" w:color="auto"/>
+        <w:insideH w:val="single" w:sz="4" w:space="0" w:color="auto"/>
+        <w:insideV w:val="single" w:sz="4" w:space="0" w:color="auto"/>
+      </w:tblBorders>
+      <w:tblCellMar>
+        <w:top w:w="0" w:type="dxa"/>
+        <w:left w:w="108" w:type="dxa"/>
+        <w:bottom w:w="0" w:type="dxa"/>
+        <w:right w:w="108" w:type="dxa"/>
+      </w:tblCellMar>
+    </w:tblPr>
+  </w:style>
+  <w:style w:type="table" w:customStyle="1" w:styleId="Tablaconcuadrcula1">
+    <w:name w:val="Tabla con cuadrícula1"/>
+    <w:basedOn w:val="Tablanormal"/>
+    <w:next w:val="Tablaconcuadrcula"/>
+    <w:uiPriority w:val="39"/>
+    <w:rsid w:val="00571F4C"/>
+    <w:pPr>
+      <w:spacing w:after="0" w:line="240" w:lineRule="auto"/>
+    </w:pPr>
+    <w:tblPr>
+      <w:tblInd w:w="0" w:type="dxa"/>
+      <w:tblBorders>
+        <w:top w:val="single" w:sz="4" w:space="0" w:color="auto"/>
+        <w:left w:val="single" w:sz="4" w:space="0" w:color="auto"/>
+        <w:bottom w:val="single" w:sz="4" w:space="0" w:color="auto"/>
+        <w:right w:val="single" w:sz="4" w:space="0" w:color="auto"/>
+        <w:insideH w:val="single" w:sz="4" w:space="0" w:color="auto"/>
+        <w:insideV w:val="single" w:sz="4" w:space="0" w:color="auto"/>
+      </w:tblBorders>
+      <w:tblCellMar>
+        <w:top w:w="0" w:type="dxa"/>
+        <w:left w:w="108" w:type="dxa"/>
+        <w:bottom w:w="0" w:type="dxa"/>
+        <w:right w:w="108" w:type="dxa"/>
+      </w:tblCellMar>
+    </w:tblPr>
+  </w:style>
+  <w:style w:type="paragraph" w:styleId="Textodeglobo">
+    <w:name w:val="Balloon Text"/>
+    <w:basedOn w:val="Normal"/>
+    <w:link w:val="TextodegloboCar"/>
+    <w:uiPriority w:val="99"/>
+    <w:semiHidden/>
+    <w:unhideWhenUsed/>
+    <w:rsid w:val="00775602"/>
+    <w:pPr>
+      <w:spacing w:after="0" w:line="240" w:lineRule="auto"/>
+    </w:pPr>
+    <w:rPr>
+      <w:rFonts w:ascii="Tahoma" w:hAnsi="Tahoma" w:cs="Tahoma"/>
+      <w:sz w:val="16"/>
+      <w:szCs w:val="16"/>
+    </w:rPr>
+  </w:style>
+  <w:style w:type="character" w:customStyle="1" w:styleId="TextodegloboCar">
+    <w:name w:val="Texto de globo Car"/>
+    <w:basedOn w:val="Fuentedeprrafopredeter"/>
+    <w:link w:val="Textodeglobo"/>
+    <w:uiPriority w:val="99"/>
+    <w:semiHidden/>
+    <w:rsid w:val="00775602"/>
+    <w:rPr>
+      <w:rFonts w:ascii="Tahoma" w:hAnsi="Tahoma" w:cs="Tahoma"/>
+      <w:sz w:val="16"/>
+      <w:szCs w:val="16"/>
+    </w:rPr>
   </w:style>
 </w:styles>
 </file>
@@ -26697,7 +27071,7 @@
     </a:clrScheme>
     <a:fontScheme name="Office">
       <a:majorFont>
-        <a:latin typeface="Calibri Light" panose="020F0302020204030204"/>
+        <a:latin typeface="Calibri Light"/>
         <a:ea typeface=""/>
         <a:cs typeface=""/>
         <a:font script="Jpan" typeface="游ゴシック Light"/>
@@ -26749,7 +27123,7 @@
         <a:font script="Tfng" typeface="Ebrima"/>
       </a:majorFont>
       <a:minorFont>
-        <a:latin typeface="Calibri" panose="020F0502020204030204"/>
+        <a:latin typeface="Calibri"/>
         <a:ea typeface=""/>
         <a:cs typeface=""/>
         <a:font script="Jpan" typeface="游明朝"/>
@@ -26943,7 +27317,7 @@
   <a:extraClrSchemeLst/>
   <a:extLst>
     <a:ext uri="{05A4C25C-085E-4340-85A3-A5531E510DB2}">
-      <thm15:themeFamily xmlns:thm15="http://schemas.microsoft.com/office/thememl/2012/main" name="Office Theme" id="{62F939B6-93AF-4DB8-9C6B-D6C7DFDC589F}" vid="{4A3C46E8-61CC-4603-A589-7422A47A8E4A}"/>
+      <thm15:themeFamily xmlns:thm15="http://schemas.microsoft.com/office/thememl/2012/main" xmlns="" name="Office Theme" id="{62F939B6-93AF-4DB8-9C6B-D6C7DFDC589F}" vid="{4A3C46E8-61CC-4603-A589-7422A47A8E4A}"/>
     </a:ext>
   </a:extLst>
 </a:theme>

</xml_diff>